<commit_message>
Reorganize notes — move SQL scripts to sql-script/ subfolder, update docs
Co-Authored-By: Claude Opus 4.6 (1M context) <noreply@anthropic.com>
</commit_message>
<xml_diff>
--- a/amolnama_news/notes/SPA.docx
+++ b/amolnama_news/notes/SPA.docx
@@ -2926,6 +2926,2192 @@
       </w:r>
     </w:p>
     <w:p/>
+    <w:p/>
+    <w:p>
+      <w:pPr>
+        <w:rPr>
+          <w:rFonts w:ascii="Segoe UI" w:hAnsi="Segoe UI" w:cs="Segoe UI"/>
+          <w:sz w:val="20"/>
+          <w:szCs w:val="20"/>
+          <w:shd w:val="clear" w:color="auto" w:fill="252526"/>
+        </w:rPr>
+      </w:pPr>
+      <w:r>
+        <w:rPr>
+          <w:rFonts w:ascii="Segoe UI" w:hAnsi="Segoe UI" w:cs="Segoe UI"/>
+          <w:sz w:val="20"/>
+          <w:szCs w:val="20"/>
+          <w:shd w:val="clear" w:color="auto" w:fill="252526"/>
+        </w:rPr>
+        <w:t>it seems SPA has all the advantages over MPA. just two concerns - SEO and complexity section - page routing which django handles everything. so how can we have SPA and also use the benefit of django SEO and routing features. can we make this hybrid?</w:t>
+      </w:r>
+    </w:p>
+    <w:p>
+      <w:pPr>
+        <w:rPr>
+          <w:rFonts w:ascii="Segoe UI" w:hAnsi="Segoe UI" w:cs="Segoe UI"/>
+          <w:sz w:val="20"/>
+          <w:szCs w:val="20"/>
+          <w:shd w:val="clear" w:color="auto" w:fill="252526"/>
+        </w:rPr>
+      </w:pPr>
+    </w:p>
+    <w:p>
+      <w:pPr>
+        <w:rPr>
+          <w:rFonts w:ascii="Segoe UI" w:hAnsi="Segoe UI" w:cs="Segoe UI"/>
+          <w:sz w:val="20"/>
+          <w:szCs w:val="20"/>
+          <w:shd w:val="clear" w:color="auto" w:fill="252526"/>
+        </w:rPr>
+      </w:pPr>
+    </w:p>
+    <w:p>
+      <w:pPr>
+        <w:shd w:val="clear" w:color="auto" w:fill="252526"/>
+        <w:spacing w:after="48" w:line="240" w:lineRule="auto"/>
+        <w:rPr>
+          <w:rFonts w:ascii="Segoe UI" w:eastAsia="Times New Roman" w:hAnsi="Segoe UI" w:cs="Segoe UI"/>
+          <w:color w:val="CCCCCC"/>
+          <w:kern w:val="0"/>
+          <w:sz w:val="20"/>
+          <w:szCs w:val="20"/>
+          <w:lang w:eastAsia="en-GB"/>
+          <w14:ligatures w14:val="none"/>
+        </w:rPr>
+      </w:pPr>
+      <w:r>
+        <w:rPr>
+          <w:rFonts w:ascii="Segoe UI" w:eastAsia="Times New Roman" w:hAnsi="Segoe UI" w:cs="Segoe UI"/>
+          <w:color w:val="CCCCCC"/>
+          <w:kern w:val="0"/>
+          <w:sz w:val="20"/>
+          <w:szCs w:val="20"/>
+          <w:lang w:eastAsia="en-GB"/>
+          <w14:ligatures w14:val="none"/>
+        </w:rPr>
+        <w:t>Yes. Exactly what I recommended — hybrid. Keep Django for SEO + routing, add AJAX content swapping for the app feel.</w:t>
+      </w:r>
+    </w:p>
+    <w:p>
+      <w:pPr>
+        <w:shd w:val="clear" w:color="auto" w:fill="252526"/>
+        <w:spacing w:before="24" w:after="48" w:line="240" w:lineRule="auto"/>
+        <w:rPr>
+          <w:rFonts w:ascii="Segoe UI" w:eastAsia="Times New Roman" w:hAnsi="Segoe UI" w:cs="Segoe UI"/>
+          <w:color w:val="CCCCCC"/>
+          <w:kern w:val="0"/>
+          <w:sz w:val="20"/>
+          <w:szCs w:val="20"/>
+          <w:lang w:eastAsia="en-GB"/>
+          <w14:ligatures w14:val="none"/>
+        </w:rPr>
+      </w:pPr>
+      <w:r>
+        <w:rPr>
+          <w:rFonts w:ascii="Segoe UI" w:eastAsia="Times New Roman" w:hAnsi="Segoe UI" w:cs="Segoe UI"/>
+          <w:b/>
+          <w:bCs/>
+          <w:color w:val="CCCCCC"/>
+          <w:kern w:val="0"/>
+          <w:sz w:val="24"/>
+          <w:szCs w:val="24"/>
+          <w:lang w:eastAsia="en-GB"/>
+          <w14:ligatures w14:val="none"/>
+        </w:rPr>
+        <w:t>How it works:</w:t>
+      </w:r>
+    </w:p>
+    <w:p>
+      <w:pPr>
+        <w:numPr>
+          <w:ilvl w:val="0"/>
+          <w:numId w:val="5"/>
+        </w:numPr>
+        <w:shd w:val="clear" w:color="auto" w:fill="252526"/>
+        <w:spacing w:before="100" w:beforeAutospacing="1" w:after="100" w:afterAutospacing="1" w:line="240" w:lineRule="auto"/>
+        <w:rPr>
+          <w:rFonts w:ascii="Segoe UI" w:eastAsia="Times New Roman" w:hAnsi="Segoe UI" w:cs="Segoe UI"/>
+          <w:color w:val="CCCCCC"/>
+          <w:kern w:val="0"/>
+          <w:sz w:val="20"/>
+          <w:szCs w:val="20"/>
+          <w:lang w:eastAsia="en-GB"/>
+          <w14:ligatures w14:val="none"/>
+        </w:rPr>
+      </w:pPr>
+      <w:r>
+        <w:rPr>
+          <w:rFonts w:ascii="Segoe UI" w:eastAsia="Times New Roman" w:hAnsi="Segoe UI" w:cs="Segoe UI"/>
+          <w:b/>
+          <w:bCs/>
+          <w:color w:val="CCCCCC"/>
+          <w:kern w:val="0"/>
+          <w:sz w:val="24"/>
+          <w:szCs w:val="24"/>
+          <w:lang w:eastAsia="en-GB"/>
+          <w14:ligatures w14:val="none"/>
+        </w:rPr>
+        <w:lastRenderedPageBreak/>
+        <w:t>First visit / hard refresh</w:t>
+      </w:r>
+      <w:r>
+        <w:rPr>
+          <w:rFonts w:ascii="Segoe UI" w:eastAsia="Times New Roman" w:hAnsi="Segoe UI" w:cs="Segoe UI"/>
+          <w:color w:val="CCCCCC"/>
+          <w:kern w:val="0"/>
+          <w:sz w:val="20"/>
+          <w:szCs w:val="20"/>
+          <w:lang w:eastAsia="en-GB"/>
+          <w14:ligatures w14:val="none"/>
+        </w:rPr>
+        <w:t> → Django renders full HTML page (SEO-friendly, Google crawls it perfectly)</w:t>
+      </w:r>
+    </w:p>
+    <w:p>
+      <w:pPr>
+        <w:numPr>
+          <w:ilvl w:val="0"/>
+          <w:numId w:val="5"/>
+        </w:numPr>
+        <w:shd w:val="clear" w:color="auto" w:fill="252526"/>
+        <w:spacing w:before="100" w:beforeAutospacing="1" w:after="100" w:afterAutospacing="1" w:line="240" w:lineRule="auto"/>
+        <w:rPr>
+          <w:rFonts w:ascii="Segoe UI" w:eastAsia="Times New Roman" w:hAnsi="Segoe UI" w:cs="Segoe UI"/>
+          <w:color w:val="CCCCCC"/>
+          <w:kern w:val="0"/>
+          <w:sz w:val="20"/>
+          <w:szCs w:val="20"/>
+          <w:lang w:eastAsia="en-GB"/>
+          <w14:ligatures w14:val="none"/>
+        </w:rPr>
+      </w:pPr>
+      <w:r>
+        <w:rPr>
+          <w:rFonts w:ascii="Segoe UI" w:eastAsia="Times New Roman" w:hAnsi="Segoe UI" w:cs="Segoe UI"/>
+          <w:b/>
+          <w:bCs/>
+          <w:color w:val="CCCCCC"/>
+          <w:kern w:val="0"/>
+          <w:sz w:val="24"/>
+          <w:szCs w:val="24"/>
+          <w:lang w:eastAsia="en-GB"/>
+          <w14:ligatures w14:val="none"/>
+        </w:rPr>
+        <w:t>Subsequent nav clicks</w:t>
+      </w:r>
+      <w:r>
+        <w:rPr>
+          <w:rFonts w:ascii="Segoe UI" w:eastAsia="Times New Roman" w:hAnsi="Segoe UI" w:cs="Segoe UI"/>
+          <w:color w:val="CCCCCC"/>
+          <w:kern w:val="0"/>
+          <w:sz w:val="20"/>
+          <w:szCs w:val="20"/>
+          <w:lang w:eastAsia="en-GB"/>
+          <w14:ligatures w14:val="none"/>
+        </w:rPr>
+        <w:t> → JS intercepts the click, fetches only the content area via AJAX, swaps it in. Sidebar/header never reload.</w:t>
+      </w:r>
+    </w:p>
+    <w:p>
+      <w:pPr>
+        <w:numPr>
+          <w:ilvl w:val="0"/>
+          <w:numId w:val="5"/>
+        </w:numPr>
+        <w:shd w:val="clear" w:color="auto" w:fill="252526"/>
+        <w:spacing w:before="100" w:beforeAutospacing="1" w:after="100" w:afterAutospacing="1" w:line="240" w:lineRule="auto"/>
+        <w:rPr>
+          <w:rFonts w:ascii="Segoe UI" w:eastAsia="Times New Roman" w:hAnsi="Segoe UI" w:cs="Segoe UI"/>
+          <w:color w:val="CCCCCC"/>
+          <w:kern w:val="0"/>
+          <w:sz w:val="20"/>
+          <w:szCs w:val="20"/>
+          <w:lang w:eastAsia="en-GB"/>
+          <w14:ligatures w14:val="none"/>
+        </w:rPr>
+      </w:pPr>
+      <w:r>
+        <w:rPr>
+          <w:rFonts w:ascii="Segoe UI" w:eastAsia="Times New Roman" w:hAnsi="Segoe UI" w:cs="Segoe UI"/>
+          <w:b/>
+          <w:bCs/>
+          <w:color w:val="CCCCCC"/>
+          <w:kern w:val="0"/>
+          <w:sz w:val="24"/>
+          <w:szCs w:val="24"/>
+          <w:lang w:eastAsia="en-GB"/>
+          <w14:ligatures w14:val="none"/>
+        </w:rPr>
+        <w:t>URL changes</w:t>
+      </w:r>
+      <w:r>
+        <w:rPr>
+          <w:rFonts w:ascii="Segoe UI" w:eastAsia="Times New Roman" w:hAnsi="Segoe UI" w:cs="Segoe UI"/>
+          <w:color w:val="CCCCCC"/>
+          <w:kern w:val="0"/>
+          <w:sz w:val="20"/>
+          <w:szCs w:val="20"/>
+          <w:lang w:eastAsia="en-GB"/>
+          <w14:ligatures w14:val="none"/>
+        </w:rPr>
+        <w:t> via </w:t>
+      </w:r>
+      <w:r>
+        <w:rPr>
+          <w:rFonts w:ascii="Courier New" w:eastAsia="Times New Roman" w:hAnsi="Courier New" w:cs="Courier New"/>
+          <w:color w:val="D7BA7D"/>
+          <w:kern w:val="0"/>
+          <w:sz w:val="18"/>
+          <w:szCs w:val="18"/>
+          <w:lang w:eastAsia="en-GB"/>
+          <w14:ligatures w14:val="none"/>
+        </w:rPr>
+        <w:t>history.pushState</w:t>
+      </w:r>
+      <w:r>
+        <w:rPr>
+          <w:rFonts w:ascii="Segoe UI" w:eastAsia="Times New Roman" w:hAnsi="Segoe UI" w:cs="Segoe UI"/>
+          <w:color w:val="CCCCCC"/>
+          <w:kern w:val="0"/>
+          <w:sz w:val="20"/>
+          <w:szCs w:val="20"/>
+          <w:lang w:eastAsia="en-GB"/>
+          <w14:ligatures w14:val="none"/>
+        </w:rPr>
+        <w:t> — browser back/forward works, URL is real and shareable</w:t>
+      </w:r>
+    </w:p>
+    <w:p>
+      <w:pPr>
+        <w:numPr>
+          <w:ilvl w:val="0"/>
+          <w:numId w:val="5"/>
+        </w:numPr>
+        <w:shd w:val="clear" w:color="auto" w:fill="252526"/>
+        <w:spacing w:before="100" w:beforeAutospacing="1" w:after="100" w:afterAutospacing="1" w:line="240" w:lineRule="auto"/>
+        <w:rPr>
+          <w:rFonts w:ascii="Segoe UI" w:eastAsia="Times New Roman" w:hAnsi="Segoe UI" w:cs="Segoe UI"/>
+          <w:color w:val="CCCCCC"/>
+          <w:kern w:val="0"/>
+          <w:sz w:val="20"/>
+          <w:szCs w:val="20"/>
+          <w:lang w:eastAsia="en-GB"/>
+          <w14:ligatures w14:val="none"/>
+        </w:rPr>
+      </w:pPr>
+      <w:r>
+        <w:rPr>
+          <w:rFonts w:ascii="Segoe UI" w:eastAsia="Times New Roman" w:hAnsi="Segoe UI" w:cs="Segoe UI"/>
+          <w:b/>
+          <w:bCs/>
+          <w:color w:val="CCCCCC"/>
+          <w:kern w:val="0"/>
+          <w:sz w:val="24"/>
+          <w:szCs w:val="24"/>
+          <w:lang w:eastAsia="en-GB"/>
+          <w14:ligatures w14:val="none"/>
+        </w:rPr>
+        <w:t>Google sees</w:t>
+      </w:r>
+      <w:r>
+        <w:rPr>
+          <w:rFonts w:ascii="Segoe UI" w:eastAsia="Times New Roman" w:hAnsi="Segoe UI" w:cs="Segoe UI"/>
+          <w:color w:val="CCCCCC"/>
+          <w:kern w:val="0"/>
+          <w:sz w:val="20"/>
+          <w:szCs w:val="20"/>
+          <w:lang w:eastAsia="en-GB"/>
+          <w14:ligatures w14:val="none"/>
+        </w:rPr>
+        <w:t> full HTML pages (because crawlers don't click — they request URLs, get full server-rendered HTML)</w:t>
+      </w:r>
+    </w:p>
+    <w:p>
+      <w:pPr>
+        <w:numPr>
+          <w:ilvl w:val="0"/>
+          <w:numId w:val="5"/>
+        </w:numPr>
+        <w:shd w:val="clear" w:color="auto" w:fill="252526"/>
+        <w:spacing w:before="100" w:beforeAutospacing="1" w:after="100" w:afterAutospacing="1" w:line="240" w:lineRule="auto"/>
+        <w:rPr>
+          <w:rFonts w:ascii="Segoe UI" w:eastAsia="Times New Roman" w:hAnsi="Segoe UI" w:cs="Segoe UI"/>
+          <w:color w:val="CCCCCC"/>
+          <w:kern w:val="0"/>
+          <w:sz w:val="20"/>
+          <w:szCs w:val="20"/>
+          <w:lang w:eastAsia="en-GB"/>
+          <w14:ligatures w14:val="none"/>
+        </w:rPr>
+      </w:pPr>
+      <w:r>
+        <w:rPr>
+          <w:rFonts w:ascii="Segoe UI" w:eastAsia="Times New Roman" w:hAnsi="Segoe UI" w:cs="Segoe UI"/>
+          <w:b/>
+          <w:bCs/>
+          <w:color w:val="CCCCCC"/>
+          <w:kern w:val="0"/>
+          <w:sz w:val="24"/>
+          <w:szCs w:val="24"/>
+          <w:lang w:eastAsia="en-GB"/>
+          <w14:ligatures w14:val="none"/>
+        </w:rPr>
+        <w:t>Users see</w:t>
+      </w:r>
+      <w:r>
+        <w:rPr>
+          <w:rFonts w:ascii="Segoe UI" w:eastAsia="Times New Roman" w:hAnsi="Segoe UI" w:cs="Segoe UI"/>
+          <w:color w:val="CCCCCC"/>
+          <w:kern w:val="0"/>
+          <w:sz w:val="20"/>
+          <w:szCs w:val="20"/>
+          <w:lang w:eastAsia="en-GB"/>
+          <w14:ligatures w14:val="none"/>
+        </w:rPr>
+        <w:t> instant SPA transitions (because JS intercepts clicks after first load)</w:t>
+      </w:r>
+    </w:p>
+    <w:p>
+      <w:pPr>
+        <w:shd w:val="clear" w:color="auto" w:fill="252526"/>
+        <w:spacing w:before="24" w:after="48" w:line="240" w:lineRule="auto"/>
+        <w:rPr>
+          <w:rFonts w:ascii="Segoe UI" w:eastAsia="Times New Roman" w:hAnsi="Segoe UI" w:cs="Segoe UI"/>
+          <w:color w:val="CCCCCC"/>
+          <w:kern w:val="0"/>
+          <w:sz w:val="20"/>
+          <w:szCs w:val="20"/>
+          <w:lang w:eastAsia="en-GB"/>
+          <w14:ligatures w14:val="none"/>
+        </w:rPr>
+      </w:pPr>
+      <w:r>
+        <w:rPr>
+          <w:rFonts w:ascii="Segoe UI" w:eastAsia="Times New Roman" w:hAnsi="Segoe UI" w:cs="Segoe UI"/>
+          <w:b/>
+          <w:bCs/>
+          <w:color w:val="CCCCCC"/>
+          <w:kern w:val="0"/>
+          <w:sz w:val="24"/>
+          <w:szCs w:val="24"/>
+          <w:lang w:eastAsia="en-GB"/>
+          <w14:ligatures w14:val="none"/>
+        </w:rPr>
+        <w:t>Best of both:</w:t>
+      </w:r>
+    </w:p>
+    <w:p>
+      <w:pPr>
+        <w:numPr>
+          <w:ilvl w:val="0"/>
+          <w:numId w:val="6"/>
+        </w:numPr>
+        <w:shd w:val="clear" w:color="auto" w:fill="252526"/>
+        <w:spacing w:before="100" w:beforeAutospacing="1" w:after="100" w:afterAutospacing="1" w:line="240" w:lineRule="auto"/>
+        <w:rPr>
+          <w:rFonts w:ascii="Segoe UI" w:eastAsia="Times New Roman" w:hAnsi="Segoe UI" w:cs="Segoe UI"/>
+          <w:color w:val="CCCCCC"/>
+          <w:kern w:val="0"/>
+          <w:sz w:val="20"/>
+          <w:szCs w:val="20"/>
+          <w:lang w:eastAsia="en-GB"/>
+          <w14:ligatures w14:val="none"/>
+        </w:rPr>
+      </w:pPr>
+      <w:r>
+        <w:rPr>
+          <w:rFonts w:ascii="Segoe UI" w:eastAsia="Times New Roman" w:hAnsi="Segoe UI" w:cs="Segoe UI"/>
+          <w:color w:val="CCCCCC"/>
+          <w:kern w:val="0"/>
+          <w:sz w:val="20"/>
+          <w:szCs w:val="20"/>
+          <w:lang w:eastAsia="en-GB"/>
+          <w14:ligatures w14:val="none"/>
+        </w:rPr>
+        <w:t>Django handles all routing, SEO, templates — zero change needed</w:t>
+      </w:r>
+    </w:p>
+    <w:p>
+      <w:pPr>
+        <w:numPr>
+          <w:ilvl w:val="0"/>
+          <w:numId w:val="6"/>
+        </w:numPr>
+        <w:shd w:val="clear" w:color="auto" w:fill="252526"/>
+        <w:spacing w:before="100" w:beforeAutospacing="1" w:after="100" w:afterAutospacing="1" w:line="240" w:lineRule="auto"/>
+        <w:rPr>
+          <w:rFonts w:ascii="Segoe UI" w:eastAsia="Times New Roman" w:hAnsi="Segoe UI" w:cs="Segoe UI"/>
+          <w:color w:val="CCCCCC"/>
+          <w:kern w:val="0"/>
+          <w:sz w:val="20"/>
+          <w:szCs w:val="20"/>
+          <w:lang w:eastAsia="en-GB"/>
+          <w14:ligatures w14:val="none"/>
+        </w:rPr>
+      </w:pPr>
+      <w:r>
+        <w:rPr>
+          <w:rFonts w:ascii="Segoe UI" w:eastAsia="Times New Roman" w:hAnsi="Segoe UI" w:cs="Segoe UI"/>
+          <w:color w:val="CCCCCC"/>
+          <w:kern w:val="0"/>
+          <w:sz w:val="20"/>
+          <w:szCs w:val="20"/>
+          <w:lang w:eastAsia="en-GB"/>
+          <w14:ligatures w14:val="none"/>
+        </w:rPr>
+        <w:t>One small JS file intercepts nav clicks and does AJAX swap</w:t>
+      </w:r>
+    </w:p>
+    <w:p>
+      <w:pPr>
+        <w:numPr>
+          <w:ilvl w:val="0"/>
+          <w:numId w:val="6"/>
+        </w:numPr>
+        <w:shd w:val="clear" w:color="auto" w:fill="252526"/>
+        <w:spacing w:before="100" w:beforeAutospacing="1" w:after="100" w:afterAutospacing="1" w:line="240" w:lineRule="auto"/>
+        <w:rPr>
+          <w:rFonts w:ascii="Segoe UI" w:eastAsia="Times New Roman" w:hAnsi="Segoe UI" w:cs="Segoe UI"/>
+          <w:color w:val="CCCCCC"/>
+          <w:kern w:val="0"/>
+          <w:sz w:val="20"/>
+          <w:szCs w:val="20"/>
+          <w:lang w:eastAsia="en-GB"/>
+          <w14:ligatures w14:val="none"/>
+        </w:rPr>
+      </w:pPr>
+      <w:r>
+        <w:rPr>
+          <w:rFonts w:ascii="Segoe UI" w:eastAsia="Times New Roman" w:hAnsi="Segoe UI" w:cs="Segoe UI"/>
+          <w:color w:val="CCCCCC"/>
+          <w:kern w:val="0"/>
+          <w:sz w:val="20"/>
+          <w:szCs w:val="20"/>
+          <w:lang w:eastAsia="en-GB"/>
+          <w14:ligatures w14:val="none"/>
+        </w:rPr>
+        <w:t>Every page still works as a standalone URL (paste in browser → full page loads)</w:t>
+      </w:r>
+    </w:p>
+    <w:p>
+      <w:pPr>
+        <w:numPr>
+          <w:ilvl w:val="0"/>
+          <w:numId w:val="6"/>
+        </w:numPr>
+        <w:shd w:val="clear" w:color="auto" w:fill="252526"/>
+        <w:spacing w:before="100" w:beforeAutospacing="1" w:after="100" w:afterAutospacing="1" w:line="240" w:lineRule="auto"/>
+        <w:rPr>
+          <w:rFonts w:ascii="Segoe UI" w:eastAsia="Times New Roman" w:hAnsi="Segoe UI" w:cs="Segoe UI"/>
+          <w:color w:val="CCCCCC"/>
+          <w:kern w:val="0"/>
+          <w:sz w:val="20"/>
+          <w:szCs w:val="20"/>
+          <w:lang w:eastAsia="en-GB"/>
+          <w14:ligatures w14:val="none"/>
+        </w:rPr>
+      </w:pPr>
+      <w:r>
+        <w:rPr>
+          <w:rFonts w:ascii="Segoe UI" w:eastAsia="Times New Roman" w:hAnsi="Segoe UI" w:cs="Segoe UI"/>
+          <w:color w:val="CCCCCC"/>
+          <w:kern w:val="0"/>
+          <w:sz w:val="20"/>
+          <w:szCs w:val="20"/>
+          <w:lang w:eastAsia="en-GB"/>
+          <w14:ligatures w14:val="none"/>
+        </w:rPr>
+        <w:t>The sidebar, header, notifications, messenger badge — all stay alive between navigations</w:t>
+      </w:r>
+    </w:p>
+    <w:p>
+      <w:pPr>
+        <w:shd w:val="clear" w:color="auto" w:fill="252526"/>
+        <w:spacing w:before="24" w:after="48" w:line="240" w:lineRule="auto"/>
+        <w:rPr>
+          <w:rFonts w:ascii="Segoe UI" w:eastAsia="Times New Roman" w:hAnsi="Segoe UI" w:cs="Segoe UI"/>
+          <w:color w:val="CCCCCC"/>
+          <w:kern w:val="0"/>
+          <w:sz w:val="20"/>
+          <w:szCs w:val="20"/>
+          <w:lang w:eastAsia="en-GB"/>
+          <w14:ligatures w14:val="none"/>
+        </w:rPr>
+      </w:pPr>
+      <w:r>
+        <w:rPr>
+          <w:rFonts w:ascii="Segoe UI" w:eastAsia="Times New Roman" w:hAnsi="Segoe UI" w:cs="Segoe UI"/>
+          <w:b/>
+          <w:bCs/>
+          <w:color w:val="CCCCCC"/>
+          <w:kern w:val="0"/>
+          <w:sz w:val="24"/>
+          <w:szCs w:val="24"/>
+          <w:lang w:eastAsia="en-GB"/>
+          <w14:ligatures w14:val="none"/>
+        </w:rPr>
+        <w:t>What changes:</w:t>
+      </w:r>
+    </w:p>
+    <w:p>
+      <w:pPr>
+        <w:numPr>
+          <w:ilvl w:val="0"/>
+          <w:numId w:val="7"/>
+        </w:numPr>
+        <w:shd w:val="clear" w:color="auto" w:fill="252526"/>
+        <w:spacing w:before="100" w:beforeAutospacing="1" w:after="100" w:afterAutospacing="1" w:line="240" w:lineRule="auto"/>
+        <w:rPr>
+          <w:rFonts w:ascii="Segoe UI" w:eastAsia="Times New Roman" w:hAnsi="Segoe UI" w:cs="Segoe UI"/>
+          <w:color w:val="CCCCCC"/>
+          <w:kern w:val="0"/>
+          <w:sz w:val="20"/>
+          <w:szCs w:val="20"/>
+          <w:lang w:eastAsia="en-GB"/>
+          <w14:ligatures w14:val="none"/>
+        </w:rPr>
+      </w:pPr>
+      <w:r>
+        <w:rPr>
+          <w:rFonts w:ascii="Segoe UI" w:eastAsia="Times New Roman" w:hAnsi="Segoe UI" w:cs="Segoe UI"/>
+          <w:color w:val="CCCCCC"/>
+          <w:kern w:val="0"/>
+          <w:sz w:val="20"/>
+          <w:szCs w:val="20"/>
+          <w:lang w:eastAsia="en-GB"/>
+          <w14:ligatures w14:val="none"/>
+        </w:rPr>
+        <w:t>One new JS file: </w:t>
+      </w:r>
+      <w:r>
+        <w:rPr>
+          <w:rFonts w:ascii="Courier New" w:eastAsia="Times New Roman" w:hAnsi="Courier New" w:cs="Courier New"/>
+          <w:color w:val="D7BA7D"/>
+          <w:kern w:val="0"/>
+          <w:sz w:val="18"/>
+          <w:szCs w:val="18"/>
+          <w:lang w:eastAsia="en-GB"/>
+          <w14:ligatures w14:val="none"/>
+        </w:rPr>
+        <w:t>spa-navigation.js</w:t>
+      </w:r>
+      <w:r>
+        <w:rPr>
+          <w:rFonts w:ascii="Segoe UI" w:eastAsia="Times New Roman" w:hAnsi="Segoe UI" w:cs="Segoe UI"/>
+          <w:color w:val="CCCCCC"/>
+          <w:kern w:val="0"/>
+          <w:sz w:val="20"/>
+          <w:szCs w:val="20"/>
+          <w:lang w:eastAsia="en-GB"/>
+          <w14:ligatures w14:val="none"/>
+        </w:rPr>
+        <w:t> (~50 lines)</w:t>
+      </w:r>
+    </w:p>
+    <w:p>
+      <w:pPr>
+        <w:numPr>
+          <w:ilvl w:val="0"/>
+          <w:numId w:val="7"/>
+        </w:numPr>
+        <w:shd w:val="clear" w:color="auto" w:fill="252526"/>
+        <w:spacing w:before="100" w:beforeAutospacing="1" w:after="100" w:afterAutospacing="1" w:line="240" w:lineRule="auto"/>
+        <w:rPr>
+          <w:rFonts w:ascii="Segoe UI" w:eastAsia="Times New Roman" w:hAnsi="Segoe UI" w:cs="Segoe UI"/>
+          <w:color w:val="CCCCCC"/>
+          <w:kern w:val="0"/>
+          <w:sz w:val="20"/>
+          <w:szCs w:val="20"/>
+          <w:lang w:eastAsia="en-GB"/>
+          <w14:ligatures w14:val="none"/>
+        </w:rPr>
+      </w:pPr>
+      <w:r>
+        <w:rPr>
+          <w:rFonts w:ascii="Segoe UI" w:eastAsia="Times New Roman" w:hAnsi="Segoe UI" w:cs="Segoe UI"/>
+          <w:color w:val="CCCCCC"/>
+          <w:kern w:val="0"/>
+          <w:sz w:val="20"/>
+          <w:szCs w:val="20"/>
+          <w:lang w:eastAsia="en-GB"/>
+          <w14:ligatures w14:val="none"/>
+        </w:rPr>
+        <w:t>Each Django view adds a check: if AJAX request → return only </w:t>
+      </w:r>
+      <w:r>
+        <w:rPr>
+          <w:rFonts w:ascii="Courier New" w:eastAsia="Times New Roman" w:hAnsi="Courier New" w:cs="Courier New"/>
+          <w:color w:val="D7BA7D"/>
+          <w:kern w:val="0"/>
+          <w:sz w:val="18"/>
+          <w:szCs w:val="18"/>
+          <w:lang w:eastAsia="en-GB"/>
+          <w14:ligatures w14:val="none"/>
+        </w:rPr>
+        <w:t>{% block content %}</w:t>
+      </w:r>
+      <w:r>
+        <w:rPr>
+          <w:rFonts w:ascii="Segoe UI" w:eastAsia="Times New Roman" w:hAnsi="Segoe UI" w:cs="Segoe UI"/>
+          <w:color w:val="CCCCCC"/>
+          <w:kern w:val="0"/>
+          <w:sz w:val="20"/>
+          <w:szCs w:val="20"/>
+          <w:lang w:eastAsia="en-GB"/>
+          <w14:ligatures w14:val="none"/>
+        </w:rPr>
+        <w:t>, not the full base.html</w:t>
+      </w:r>
+    </w:p>
+    <w:p>
+      <w:pPr>
+        <w:numPr>
+          <w:ilvl w:val="0"/>
+          <w:numId w:val="7"/>
+        </w:numPr>
+        <w:shd w:val="clear" w:color="auto" w:fill="252526"/>
+        <w:spacing w:before="100" w:beforeAutospacing="1" w:after="100" w:afterAutospacing="1" w:line="240" w:lineRule="auto"/>
+        <w:rPr>
+          <w:rFonts w:ascii="Segoe UI" w:eastAsia="Times New Roman" w:hAnsi="Segoe UI" w:cs="Segoe UI"/>
+          <w:color w:val="CCCCCC"/>
+          <w:kern w:val="0"/>
+          <w:sz w:val="20"/>
+          <w:szCs w:val="20"/>
+          <w:lang w:eastAsia="en-GB"/>
+          <w14:ligatures w14:val="none"/>
+        </w:rPr>
+      </w:pPr>
+      <w:r>
+        <w:rPr>
+          <w:rFonts w:ascii="Segoe UI" w:eastAsia="Times New Roman" w:hAnsi="Segoe UI" w:cs="Segoe UI"/>
+          <w:color w:val="CCCCCC"/>
+          <w:kern w:val="0"/>
+          <w:sz w:val="20"/>
+          <w:szCs w:val="20"/>
+          <w:lang w:eastAsia="en-GB"/>
+          <w14:ligatures w14:val="none"/>
+        </w:rPr>
+        <w:t>That's it. No React, no Vue, no framework. Plain JS.</w:t>
+      </w:r>
+    </w:p>
+    <w:p>
+      <w:pPr>
+        <w:shd w:val="clear" w:color="auto" w:fill="252526"/>
+        <w:spacing w:before="24" w:after="48" w:line="240" w:lineRule="auto"/>
+        <w:rPr>
+          <w:rFonts w:ascii="Segoe UI" w:eastAsia="Times New Roman" w:hAnsi="Segoe UI" w:cs="Segoe UI"/>
+          <w:color w:val="CCCCCC"/>
+          <w:kern w:val="0"/>
+          <w:sz w:val="20"/>
+          <w:szCs w:val="20"/>
+          <w:lang w:eastAsia="en-GB"/>
+          <w14:ligatures w14:val="none"/>
+        </w:rPr>
+      </w:pPr>
+      <w:r>
+        <w:rPr>
+          <w:rFonts w:ascii="Segoe UI" w:eastAsia="Times New Roman" w:hAnsi="Segoe UI" w:cs="Segoe UI"/>
+          <w:color w:val="CCCCCC"/>
+          <w:kern w:val="0"/>
+          <w:sz w:val="20"/>
+          <w:szCs w:val="20"/>
+          <w:lang w:eastAsia="en-GB"/>
+          <w14:ligatures w14:val="none"/>
+        </w:rPr>
+        <w:t xml:space="preserve">This is how GitHub, Basecamp, and Hey.com work — they call it </w:t>
+      </w:r>
+      <w:r>
+        <w:rPr>
+          <w:rFonts w:ascii="Segoe UI" w:eastAsia="Times New Roman" w:hAnsi="Segoe UI" w:cs="Segoe UI"/>
+          <w:b/>
+          <w:bCs/>
+          <w:color w:val="CCCCCC"/>
+          <w:kern w:val="0"/>
+          <w:sz w:val="24"/>
+          <w:szCs w:val="24"/>
+          <w:lang w:eastAsia="en-GB"/>
+          <w14:ligatures w14:val="none"/>
+        </w:rPr>
+        <w:t>Turbo/PJAX</w:t>
+      </w:r>
+      <w:r>
+        <w:rPr>
+          <w:rFonts w:ascii="Segoe UI" w:eastAsia="Times New Roman" w:hAnsi="Segoe UI" w:cs="Segoe UI"/>
+          <w:color w:val="CCCCCC"/>
+          <w:kern w:val="0"/>
+          <w:sz w:val="20"/>
+          <w:szCs w:val="20"/>
+          <w:lang w:eastAsia="en-GB"/>
+          <w14:ligatures w14:val="none"/>
+        </w:rPr>
+        <w:t xml:space="preserve"> pattern. Same Django backend, instant frontend.</w:t>
+      </w:r>
+    </w:p>
+    <w:p>
+      <w:pPr>
+        <w:shd w:val="clear" w:color="auto" w:fill="252526"/>
+        <w:spacing w:before="24" w:after="48" w:line="240" w:lineRule="auto"/>
+        <w:rPr>
+          <w:rFonts w:ascii="Segoe UI" w:eastAsia="Times New Roman" w:hAnsi="Segoe UI" w:cs="Segoe UI"/>
+          <w:color w:val="CCCCCC"/>
+          <w:kern w:val="0"/>
+          <w:sz w:val="20"/>
+          <w:szCs w:val="20"/>
+          <w:lang w:eastAsia="en-GB"/>
+          <w14:ligatures w14:val="none"/>
+        </w:rPr>
+      </w:pPr>
+      <w:r>
+        <w:rPr>
+          <w:rFonts w:ascii="Segoe UI" w:eastAsia="Times New Roman" w:hAnsi="Segoe UI" w:cs="Segoe UI"/>
+          <w:color w:val="CCCCCC"/>
+          <w:kern w:val="0"/>
+          <w:sz w:val="20"/>
+          <w:szCs w:val="20"/>
+          <w:lang w:eastAsia="en-GB"/>
+          <w14:ligatures w14:val="none"/>
+        </w:rPr>
+        <w:t>Want me to plan and implement this?</w:t>
+      </w:r>
+    </w:p>
+    <w:p/>
+    <w:p/>
+    <w:p>
+      <w:pPr>
+        <w:rPr>
+          <w:rFonts w:ascii="Segoe UI" w:hAnsi="Segoe UI" w:cs="Segoe UI"/>
+          <w:color w:val="CCCCCC"/>
+          <w:sz w:val="20"/>
+          <w:szCs w:val="20"/>
+          <w:shd w:val="clear" w:color="auto" w:fill="3C3C3C"/>
+        </w:rPr>
+      </w:pPr>
+      <w:r>
+        <w:rPr>
+          <w:rFonts w:ascii="Segoe UI" w:hAnsi="Segoe UI" w:cs="Segoe UI"/>
+          <w:color w:val="CCCCCC"/>
+          <w:sz w:val="20"/>
+          <w:szCs w:val="20"/>
+          <w:shd w:val="clear" w:color="auto" w:fill="3C3C3C"/>
+        </w:rPr>
+        <w:t>some page specific css or js load maybe slower. because i can see there is sutble shift of displaying after a sec or less than a sec.</w:t>
+      </w:r>
+    </w:p>
+    <w:p>
+      <w:pPr>
+        <w:rPr>
+          <w:rFonts w:ascii="Segoe UI" w:hAnsi="Segoe UI" w:cs="Segoe UI"/>
+          <w:color w:val="CCCCCC"/>
+          <w:sz w:val="20"/>
+          <w:szCs w:val="20"/>
+          <w:shd w:val="clear" w:color="auto" w:fill="3C3C3C"/>
+        </w:rPr>
+      </w:pPr>
+    </w:p>
+    <w:p>
+      <w:pPr>
+        <w:rPr>
+          <w:rFonts w:ascii="Segoe UI" w:hAnsi="Segoe UI" w:cs="Segoe UI"/>
+          <w:color w:val="CCCCCC"/>
+          <w:sz w:val="20"/>
+          <w:szCs w:val="20"/>
+          <w:shd w:val="clear" w:color="auto" w:fill="3C3C3C"/>
+        </w:rPr>
+      </w:pPr>
+    </w:p>
+    <w:p>
+      <w:pPr>
+        <w:spacing w:before="100" w:beforeAutospacing="1" w:after="100" w:afterAutospacing="1" w:line="240" w:lineRule="auto"/>
+        <w:outlineLvl w:val="0"/>
+        <w:rPr>
+          <w:rFonts w:ascii="Times New Roman" w:eastAsia="Times New Roman" w:hAnsi="Times New Roman" w:cs="Times New Roman"/>
+          <w:b/>
+          <w:bCs/>
+          <w:kern w:val="36"/>
+          <w:sz w:val="48"/>
+          <w:szCs w:val="48"/>
+          <w:lang w:eastAsia="en-GB"/>
+          <w14:ligatures w14:val="none"/>
+        </w:rPr>
+      </w:pPr>
+      <w:r>
+        <w:rPr>
+          <w:rFonts w:ascii="Times New Roman" w:eastAsia="Times New Roman" w:hAnsi="Times New Roman" w:cs="Times New Roman"/>
+          <w:b/>
+          <w:bCs/>
+          <w:kern w:val="36"/>
+          <w:sz w:val="48"/>
+          <w:szCs w:val="48"/>
+          <w:lang w:eastAsia="en-GB"/>
+          <w14:ligatures w14:val="none"/>
+        </w:rPr>
+        <w:t>I am seeing double flash of display after moving to the SPA from MAP of django. why is this happening?</w:t>
+      </w:r>
+    </w:p>
+    <w:p>
+      <w:pPr>
+        <w:spacing w:before="100" w:beforeAutospacing="1" w:after="100" w:afterAutospacing="1" w:line="240" w:lineRule="auto"/>
+        <w:rPr>
+          <w:rFonts w:ascii="Times New Roman" w:eastAsia="Times New Roman" w:hAnsi="Times New Roman" w:cs="Times New Roman"/>
+          <w:kern w:val="0"/>
+          <w:sz w:val="24"/>
+          <w:szCs w:val="24"/>
+          <w:lang w:eastAsia="en-GB"/>
+          <w14:ligatures w14:val="none"/>
+        </w:rPr>
+      </w:pPr>
+      <w:r>
+        <w:rPr>
+          <w:rFonts w:ascii="Times New Roman" w:eastAsia="Times New Roman" w:hAnsi="Times New Roman" w:cs="Times New Roman"/>
+          <w:kern w:val="0"/>
+          <w:sz w:val="24"/>
+          <w:szCs w:val="24"/>
+          <w:lang w:eastAsia="en-GB"/>
+          <w14:ligatures w14:val="none"/>
+        </w:rPr>
+        <w:t xml:space="preserve">The "double flash" (or double render) is a classic symptom of transitioning from a </w:t>
+      </w:r>
+      <w:r>
+        <w:rPr>
+          <w:rFonts w:ascii="Times New Roman" w:eastAsia="Times New Roman" w:hAnsi="Times New Roman" w:cs="Times New Roman"/>
+          <w:b/>
+          <w:bCs/>
+          <w:kern w:val="0"/>
+          <w:sz w:val="24"/>
+          <w:szCs w:val="24"/>
+          <w:lang w:eastAsia="en-GB"/>
+          <w14:ligatures w14:val="none"/>
+        </w:rPr>
+        <w:t>Multi-Page Application (MPA)</w:t>
+      </w:r>
+      <w:r>
+        <w:rPr>
+          <w:rFonts w:ascii="Times New Roman" w:eastAsia="Times New Roman" w:hAnsi="Times New Roman" w:cs="Times New Roman"/>
+          <w:kern w:val="0"/>
+          <w:sz w:val="24"/>
+          <w:szCs w:val="24"/>
+          <w:lang w:eastAsia="en-GB"/>
+          <w14:ligatures w14:val="none"/>
+        </w:rPr>
+        <w:t xml:space="preserve"> to a </w:t>
+      </w:r>
+      <w:r>
+        <w:rPr>
+          <w:rFonts w:ascii="Times New Roman" w:eastAsia="Times New Roman" w:hAnsi="Times New Roman" w:cs="Times New Roman"/>
+          <w:b/>
+          <w:bCs/>
+          <w:kern w:val="0"/>
+          <w:sz w:val="24"/>
+          <w:szCs w:val="24"/>
+          <w:lang w:eastAsia="en-GB"/>
+          <w14:ligatures w14:val="none"/>
+        </w:rPr>
+        <w:t>Single-Page Application (SPA)</w:t>
+      </w:r>
+      <w:r>
+        <w:rPr>
+          <w:rFonts w:ascii="Times New Roman" w:eastAsia="Times New Roman" w:hAnsi="Times New Roman" w:cs="Times New Roman"/>
+          <w:kern w:val="0"/>
+          <w:sz w:val="24"/>
+          <w:szCs w:val="24"/>
+          <w:lang w:eastAsia="en-GB"/>
+          <w14:ligatures w14:val="none"/>
+        </w:rPr>
+        <w:t xml:space="preserve"> hybrid. In the professional world, this is usually called </w:t>
+      </w:r>
+      <w:r>
+        <w:rPr>
+          <w:rFonts w:ascii="Times New Roman" w:eastAsia="Times New Roman" w:hAnsi="Times New Roman" w:cs="Times New Roman"/>
+          <w:b/>
+          <w:bCs/>
+          <w:kern w:val="0"/>
+          <w:sz w:val="24"/>
+          <w:szCs w:val="24"/>
+          <w:lang w:eastAsia="en-GB"/>
+          <w14:ligatures w14:val="none"/>
+        </w:rPr>
+        <w:t>Hydration Mismatch</w:t>
+      </w:r>
+      <w:r>
+        <w:rPr>
+          <w:rFonts w:ascii="Times New Roman" w:eastAsia="Times New Roman" w:hAnsi="Times New Roman" w:cs="Times New Roman"/>
+          <w:kern w:val="0"/>
+          <w:sz w:val="24"/>
+          <w:szCs w:val="24"/>
+          <w:lang w:eastAsia="en-GB"/>
+          <w14:ligatures w14:val="none"/>
+        </w:rPr>
+        <w:t xml:space="preserve"> or </w:t>
+      </w:r>
+      <w:r>
+        <w:rPr>
+          <w:rFonts w:ascii="Times New Roman" w:eastAsia="Times New Roman" w:hAnsi="Times New Roman" w:cs="Times New Roman"/>
+          <w:b/>
+          <w:bCs/>
+          <w:kern w:val="0"/>
+          <w:sz w:val="24"/>
+          <w:szCs w:val="24"/>
+          <w:lang w:eastAsia="en-GB"/>
+          <w14:ligatures w14:val="none"/>
+        </w:rPr>
+        <w:t>FOUC (Flash of Unstyled Content)</w:t>
+      </w:r>
+      <w:r>
+        <w:rPr>
+          <w:rFonts w:ascii="Times New Roman" w:eastAsia="Times New Roman" w:hAnsi="Times New Roman" w:cs="Times New Roman"/>
+          <w:kern w:val="0"/>
+          <w:sz w:val="24"/>
+          <w:szCs w:val="24"/>
+          <w:lang w:eastAsia="en-GB"/>
+          <w14:ligatures w14:val="none"/>
+        </w:rPr>
+        <w:t>.</w:t>
+      </w:r>
+    </w:p>
+    <w:p>
+      <w:pPr>
+        <w:spacing w:before="100" w:beforeAutospacing="1" w:after="100" w:afterAutospacing="1" w:line="240" w:lineRule="auto"/>
+        <w:rPr>
+          <w:rFonts w:ascii="Times New Roman" w:eastAsia="Times New Roman" w:hAnsi="Times New Roman" w:cs="Times New Roman"/>
+          <w:kern w:val="0"/>
+          <w:sz w:val="24"/>
+          <w:szCs w:val="24"/>
+          <w:lang w:eastAsia="en-GB"/>
+          <w14:ligatures w14:val="none"/>
+        </w:rPr>
+      </w:pPr>
+      <w:r>
+        <w:rPr>
+          <w:rFonts w:ascii="Times New Roman" w:eastAsia="Times New Roman" w:hAnsi="Times New Roman" w:cs="Times New Roman"/>
+          <w:kern w:val="0"/>
+          <w:sz w:val="24"/>
+          <w:szCs w:val="24"/>
+          <w:lang w:eastAsia="en-GB"/>
+          <w14:ligatures w14:val="none"/>
+        </w:rPr>
+        <w:lastRenderedPageBreak/>
+        <w:t>Since you are using Django as the backbone for an SPA-style app, here is why it’s happening and how to fix it like a pro.</w:t>
+      </w:r>
+    </w:p>
+    <w:p>
+      <w:pPr>
+        <w:spacing w:after="0" w:line="240" w:lineRule="auto"/>
+        <w:rPr>
+          <w:rFonts w:ascii="Times New Roman" w:eastAsia="Times New Roman" w:hAnsi="Times New Roman" w:cs="Times New Roman"/>
+          <w:kern w:val="0"/>
+          <w:sz w:val="24"/>
+          <w:szCs w:val="24"/>
+          <w:lang w:eastAsia="en-GB"/>
+          <w14:ligatures w14:val="none"/>
+        </w:rPr>
+      </w:pPr>
+      <w:r>
+        <w:rPr>
+          <w:rFonts w:ascii="Times New Roman" w:eastAsia="Times New Roman" w:hAnsi="Times New Roman" w:cs="Times New Roman"/>
+          <w:kern w:val="0"/>
+          <w:sz w:val="24"/>
+          <w:szCs w:val="24"/>
+          <w:lang w:eastAsia="en-GB"/>
+          <w14:ligatures w14:val="none"/>
+        </w:rPr>
+        <w:pict w14:anchorId="5837014A">
+          <v:rect id="_x0000_i1025" style="width:0;height:1.5pt" o:hralign="center" o:hrstd="t" o:hr="t" fillcolor="#a0a0a0" stroked="f"/>
+        </w:pict>
+      </w:r>
+    </w:p>
+    <w:p>
+      <w:pPr>
+        <w:spacing w:before="100" w:beforeAutospacing="1" w:after="100" w:afterAutospacing="1" w:line="240" w:lineRule="auto"/>
+        <w:outlineLvl w:val="2"/>
+        <w:rPr>
+          <w:rFonts w:ascii="Times New Roman" w:eastAsia="Times New Roman" w:hAnsi="Times New Roman" w:cs="Times New Roman"/>
+          <w:b/>
+          <w:bCs/>
+          <w:kern w:val="0"/>
+          <w:sz w:val="27"/>
+          <w:szCs w:val="27"/>
+          <w:lang w:eastAsia="en-GB"/>
+          <w14:ligatures w14:val="none"/>
+        </w:rPr>
+      </w:pPr>
+      <w:r>
+        <w:rPr>
+          <w:rFonts w:ascii="Times New Roman" w:eastAsia="Times New Roman" w:hAnsi="Times New Roman" w:cs="Times New Roman"/>
+          <w:b/>
+          <w:bCs/>
+          <w:kern w:val="0"/>
+          <w:sz w:val="27"/>
+          <w:szCs w:val="27"/>
+          <w:lang w:eastAsia="en-GB"/>
+          <w14:ligatures w14:val="none"/>
+        </w:rPr>
+        <w:t>1. The Root Cause: The "Baton Pass"</w:t>
+      </w:r>
+    </w:p>
+    <w:p>
+      <w:pPr>
+        <w:spacing w:before="100" w:beforeAutospacing="1" w:after="100" w:afterAutospacing="1" w:line="240" w:lineRule="auto"/>
+        <w:rPr>
+          <w:rFonts w:ascii="Times New Roman" w:eastAsia="Times New Roman" w:hAnsi="Times New Roman" w:cs="Times New Roman"/>
+          <w:kern w:val="0"/>
+          <w:sz w:val="24"/>
+          <w:szCs w:val="24"/>
+          <w:lang w:eastAsia="en-GB"/>
+          <w14:ligatures w14:val="none"/>
+        </w:rPr>
+      </w:pPr>
+      <w:r>
+        <w:rPr>
+          <w:rFonts w:ascii="Times New Roman" w:eastAsia="Times New Roman" w:hAnsi="Times New Roman" w:cs="Times New Roman"/>
+          <w:kern w:val="0"/>
+          <w:sz w:val="24"/>
+          <w:szCs w:val="24"/>
+          <w:lang w:eastAsia="en-GB"/>
+          <w14:ligatures w14:val="none"/>
+        </w:rPr>
+        <w:t>When you load a page, two different engines are trying to draw the UI, and they aren't perfectly synced:</w:t>
+      </w:r>
+    </w:p>
+    <w:p>
+      <w:pPr>
+        <w:numPr>
+          <w:ilvl w:val="0"/>
+          <w:numId w:val="8"/>
+        </w:numPr>
+        <w:spacing w:before="100" w:beforeAutospacing="1" w:after="100" w:afterAutospacing="1" w:line="240" w:lineRule="auto"/>
+        <w:rPr>
+          <w:rFonts w:ascii="Times New Roman" w:eastAsia="Times New Roman" w:hAnsi="Times New Roman" w:cs="Times New Roman"/>
+          <w:kern w:val="0"/>
+          <w:sz w:val="24"/>
+          <w:szCs w:val="24"/>
+          <w:lang w:eastAsia="en-GB"/>
+          <w14:ligatures w14:val="none"/>
+        </w:rPr>
+      </w:pPr>
+      <w:r>
+        <w:rPr>
+          <w:rFonts w:ascii="Times New Roman" w:eastAsia="Times New Roman" w:hAnsi="Times New Roman" w:cs="Times New Roman"/>
+          <w:b/>
+          <w:bCs/>
+          <w:kern w:val="0"/>
+          <w:sz w:val="24"/>
+          <w:szCs w:val="24"/>
+          <w:lang w:eastAsia="en-GB"/>
+          <w14:ligatures w14:val="none"/>
+        </w:rPr>
+        <w:t>The First Flash (Django):</w:t>
+      </w:r>
+      <w:r>
+        <w:rPr>
+          <w:rFonts w:ascii="Times New Roman" w:eastAsia="Times New Roman" w:hAnsi="Times New Roman" w:cs="Times New Roman"/>
+          <w:kern w:val="0"/>
+          <w:sz w:val="24"/>
+          <w:szCs w:val="24"/>
+          <w:lang w:eastAsia="en-GB"/>
+          <w14:ligatures w14:val="none"/>
+        </w:rPr>
+        <w:t xml:space="preserve"> Django sends a raw HTML file to the browser. If your CSS is linked externally, the browser might show the unstyled HTML for a split second before the CSS arrives.</w:t>
+      </w:r>
+    </w:p>
+    <w:p>
+      <w:pPr>
+        <w:numPr>
+          <w:ilvl w:val="0"/>
+          <w:numId w:val="8"/>
+        </w:numPr>
+        <w:spacing w:before="100" w:beforeAutospacing="1" w:after="100" w:afterAutospacing="1" w:line="240" w:lineRule="auto"/>
+        <w:rPr>
+          <w:rFonts w:ascii="Times New Roman" w:eastAsia="Times New Roman" w:hAnsi="Times New Roman" w:cs="Times New Roman"/>
+          <w:kern w:val="0"/>
+          <w:sz w:val="24"/>
+          <w:szCs w:val="24"/>
+          <w:lang w:eastAsia="en-GB"/>
+          <w14:ligatures w14:val="none"/>
+        </w:rPr>
+      </w:pPr>
+      <w:r>
+        <w:rPr>
+          <w:rFonts w:ascii="Times New Roman" w:eastAsia="Times New Roman" w:hAnsi="Times New Roman" w:cs="Times New Roman"/>
+          <w:b/>
+          <w:bCs/>
+          <w:kern w:val="0"/>
+          <w:sz w:val="24"/>
+          <w:szCs w:val="24"/>
+          <w:lang w:eastAsia="en-GB"/>
+          <w14:ligatures w14:val="none"/>
+        </w:rPr>
+        <w:t>The Second Flash (SPA/React/Vue):</w:t>
+      </w:r>
+      <w:r>
+        <w:rPr>
+          <w:rFonts w:ascii="Times New Roman" w:eastAsia="Times New Roman" w:hAnsi="Times New Roman" w:cs="Times New Roman"/>
+          <w:kern w:val="0"/>
+          <w:sz w:val="24"/>
+          <w:szCs w:val="24"/>
+          <w:lang w:eastAsia="en-GB"/>
+          <w14:ligatures w14:val="none"/>
+        </w:rPr>
+        <w:t xml:space="preserve"> Once the page is "visible," your JavaScript (React/Vue/Vite) kicks in. It clears out what Django rendered and "re-paints" the entire page with the SPA components.</w:t>
+      </w:r>
+    </w:p>
+    <w:p>
+      <w:pPr>
+        <w:spacing w:before="100" w:beforeAutospacing="1" w:after="100" w:afterAutospacing="1" w:line="240" w:lineRule="auto"/>
+        <w:rPr>
+          <w:rFonts w:ascii="Times New Roman" w:eastAsia="Times New Roman" w:hAnsi="Times New Roman" w:cs="Times New Roman"/>
+          <w:kern w:val="0"/>
+          <w:sz w:val="24"/>
+          <w:szCs w:val="24"/>
+          <w:lang w:eastAsia="en-GB"/>
+          <w14:ligatures w14:val="none"/>
+        </w:rPr>
+      </w:pPr>
+      <w:r>
+        <w:rPr>
+          <w:rFonts w:ascii="Times New Roman" w:eastAsia="Times New Roman" w:hAnsi="Times New Roman" w:cs="Times New Roman"/>
+          <w:kern w:val="0"/>
+          <w:sz w:val="24"/>
+          <w:szCs w:val="24"/>
+          <w:lang w:eastAsia="en-GB"/>
+          <w14:ligatures w14:val="none"/>
+        </w:rPr>
+        <w:t xml:space="preserve">If the </w:t>
+      </w:r>
+      <w:r>
+        <w:rPr>
+          <w:rFonts w:ascii="Times New Roman" w:eastAsia="Times New Roman" w:hAnsi="Times New Roman" w:cs="Times New Roman"/>
+          <w:b/>
+          <w:bCs/>
+          <w:kern w:val="0"/>
+          <w:sz w:val="24"/>
+          <w:szCs w:val="24"/>
+          <w:lang w:eastAsia="en-GB"/>
+          <w14:ligatures w14:val="none"/>
+        </w:rPr>
+        <w:t>Django HTML</w:t>
+      </w:r>
+      <w:r>
+        <w:rPr>
+          <w:rFonts w:ascii="Times New Roman" w:eastAsia="Times New Roman" w:hAnsi="Times New Roman" w:cs="Times New Roman"/>
+          <w:kern w:val="0"/>
+          <w:sz w:val="24"/>
+          <w:szCs w:val="24"/>
+          <w:lang w:eastAsia="en-GB"/>
+          <w14:ligatures w14:val="none"/>
+        </w:rPr>
+        <w:t xml:space="preserve"> and the </w:t>
+      </w:r>
+      <w:r>
+        <w:rPr>
+          <w:rFonts w:ascii="Times New Roman" w:eastAsia="Times New Roman" w:hAnsi="Times New Roman" w:cs="Times New Roman"/>
+          <w:b/>
+          <w:bCs/>
+          <w:kern w:val="0"/>
+          <w:sz w:val="24"/>
+          <w:szCs w:val="24"/>
+          <w:lang w:eastAsia="en-GB"/>
+          <w14:ligatures w14:val="none"/>
+        </w:rPr>
+        <w:t>SPA Component</w:t>
+      </w:r>
+      <w:r>
+        <w:rPr>
+          <w:rFonts w:ascii="Times New Roman" w:eastAsia="Times New Roman" w:hAnsi="Times New Roman" w:cs="Times New Roman"/>
+          <w:kern w:val="0"/>
+          <w:sz w:val="24"/>
+          <w:szCs w:val="24"/>
+          <w:lang w:eastAsia="en-GB"/>
+          <w14:ligatures w14:val="none"/>
+        </w:rPr>
+        <w:t xml:space="preserve"> don't match 100% in structure, the browser deletes the old one and snaps the new one in, causing a visible "jump" or flicker.</w:t>
+      </w:r>
+    </w:p>
+    <w:p>
+      <w:pPr>
+        <w:spacing w:after="0" w:line="240" w:lineRule="auto"/>
+        <w:rPr>
+          <w:rFonts w:ascii="Times New Roman" w:eastAsia="Times New Roman" w:hAnsi="Times New Roman" w:cs="Times New Roman"/>
+          <w:kern w:val="0"/>
+          <w:sz w:val="24"/>
+          <w:szCs w:val="24"/>
+          <w:lang w:eastAsia="en-GB"/>
+          <w14:ligatures w14:val="none"/>
+        </w:rPr>
+      </w:pPr>
+      <w:r>
+        <w:rPr>
+          <w:rFonts w:ascii="Times New Roman" w:eastAsia="Times New Roman" w:hAnsi="Times New Roman" w:cs="Times New Roman"/>
+          <w:kern w:val="0"/>
+          <w:sz w:val="24"/>
+          <w:szCs w:val="24"/>
+          <w:lang w:eastAsia="en-GB"/>
+          <w14:ligatures w14:val="none"/>
+        </w:rPr>
+        <w:pict w14:anchorId="51396819">
+          <v:rect id="_x0000_i1026" style="width:0;height:1.5pt" o:hralign="center" o:hrstd="t" o:hr="t" fillcolor="#a0a0a0" stroked="f"/>
+        </w:pict>
+      </w:r>
+    </w:p>
+    <w:p>
+      <w:pPr>
+        <w:spacing w:before="100" w:beforeAutospacing="1" w:after="100" w:afterAutospacing="1" w:line="240" w:lineRule="auto"/>
+        <w:outlineLvl w:val="2"/>
+        <w:rPr>
+          <w:rFonts w:ascii="Times New Roman" w:eastAsia="Times New Roman" w:hAnsi="Times New Roman" w:cs="Times New Roman"/>
+          <w:b/>
+          <w:bCs/>
+          <w:kern w:val="0"/>
+          <w:sz w:val="27"/>
+          <w:szCs w:val="27"/>
+          <w:lang w:eastAsia="en-GB"/>
+          <w14:ligatures w14:val="none"/>
+        </w:rPr>
+      </w:pPr>
+      <w:r>
+        <w:rPr>
+          <w:rFonts w:ascii="Times New Roman" w:eastAsia="Times New Roman" w:hAnsi="Times New Roman" w:cs="Times New Roman"/>
+          <w:b/>
+          <w:bCs/>
+          <w:kern w:val="0"/>
+          <w:sz w:val="27"/>
+          <w:szCs w:val="27"/>
+          <w:lang w:eastAsia="en-GB"/>
+          <w14:ligatures w14:val="none"/>
+        </w:rPr>
+        <w:t>2. Best Practice Solutions</w:t>
+      </w:r>
+    </w:p>
+    <w:p>
+      <w:pPr>
+        <w:spacing w:before="100" w:beforeAutospacing="1" w:after="100" w:afterAutospacing="1" w:line="240" w:lineRule="auto"/>
+        <w:outlineLvl w:val="2"/>
+        <w:rPr>
+          <w:rFonts w:ascii="Times New Roman" w:eastAsia="Times New Roman" w:hAnsi="Times New Roman" w:cs="Times New Roman"/>
+          <w:b/>
+          <w:bCs/>
+          <w:kern w:val="0"/>
+          <w:sz w:val="27"/>
+          <w:szCs w:val="27"/>
+          <w:lang w:eastAsia="en-GB"/>
+          <w14:ligatures w14:val="none"/>
+        </w:rPr>
+      </w:pPr>
+      <w:r>
+        <w:rPr>
+          <w:rFonts w:ascii="Times New Roman" w:eastAsia="Times New Roman" w:hAnsi="Times New Roman" w:cs="Times New Roman"/>
+          <w:b/>
+          <w:bCs/>
+          <w:kern w:val="0"/>
+          <w:sz w:val="27"/>
+          <w:szCs w:val="27"/>
+          <w:lang w:eastAsia="en-GB"/>
+          <w14:ligatures w14:val="none"/>
+        </w:rPr>
+        <w:t>A. Use the "Hidden Attribute" Trick</w:t>
+      </w:r>
+    </w:p>
+    <w:p>
+      <w:pPr>
+        <w:spacing w:before="100" w:beforeAutospacing="1" w:after="100" w:afterAutospacing="1" w:line="240" w:lineRule="auto"/>
+        <w:rPr>
+          <w:rFonts w:ascii="Times New Roman" w:eastAsia="Times New Roman" w:hAnsi="Times New Roman" w:cs="Times New Roman"/>
+          <w:kern w:val="0"/>
+          <w:sz w:val="24"/>
+          <w:szCs w:val="24"/>
+          <w:lang w:eastAsia="en-GB"/>
+          <w14:ligatures w14:val="none"/>
+        </w:rPr>
+      </w:pPr>
+      <w:r>
+        <w:rPr>
+          <w:rFonts w:ascii="Times New Roman" w:eastAsia="Times New Roman" w:hAnsi="Times New Roman" w:cs="Times New Roman"/>
+          <w:kern w:val="0"/>
+          <w:sz w:val="24"/>
+          <w:szCs w:val="24"/>
+          <w:lang w:eastAsia="en-GB"/>
+          <w14:ligatures w14:val="none"/>
+        </w:rPr>
+        <w:t xml:space="preserve">This is the simplest professional fix for "Vanilla" SPA hybrids. You prevent the browser from showing </w:t>
+      </w:r>
+      <w:r>
+        <w:rPr>
+          <w:rFonts w:ascii="Times New Roman" w:eastAsia="Times New Roman" w:hAnsi="Times New Roman" w:cs="Times New Roman"/>
+          <w:i/>
+          <w:iCs/>
+          <w:kern w:val="0"/>
+          <w:sz w:val="24"/>
+          <w:szCs w:val="24"/>
+          <w:lang w:eastAsia="en-GB"/>
+          <w14:ligatures w14:val="none"/>
+        </w:rPr>
+        <w:t>anything</w:t>
+      </w:r>
+      <w:r>
+        <w:rPr>
+          <w:rFonts w:ascii="Times New Roman" w:eastAsia="Times New Roman" w:hAnsi="Times New Roman" w:cs="Times New Roman"/>
+          <w:kern w:val="0"/>
+          <w:sz w:val="24"/>
+          <w:szCs w:val="24"/>
+          <w:lang w:eastAsia="en-GB"/>
+          <w14:ligatures w14:val="none"/>
+        </w:rPr>
+        <w:t xml:space="preserve"> until the SPA is ready to take over.</w:t>
+      </w:r>
+    </w:p>
+    <w:p>
+      <w:pPr>
+        <w:numPr>
+          <w:ilvl w:val="0"/>
+          <w:numId w:val="9"/>
+        </w:numPr>
+        <w:spacing w:before="100" w:beforeAutospacing="1" w:after="100" w:afterAutospacing="1" w:line="240" w:lineRule="auto"/>
+        <w:rPr>
+          <w:rFonts w:ascii="Times New Roman" w:eastAsia="Times New Roman" w:hAnsi="Times New Roman" w:cs="Times New Roman"/>
+          <w:kern w:val="0"/>
+          <w:sz w:val="24"/>
+          <w:szCs w:val="24"/>
+          <w:lang w:eastAsia="en-GB"/>
+          <w14:ligatures w14:val="none"/>
+        </w:rPr>
+      </w:pPr>
+      <w:r>
+        <w:rPr>
+          <w:rFonts w:ascii="Times New Roman" w:eastAsia="Times New Roman" w:hAnsi="Times New Roman" w:cs="Times New Roman"/>
+          <w:b/>
+          <w:bCs/>
+          <w:kern w:val="0"/>
+          <w:sz w:val="24"/>
+          <w:szCs w:val="24"/>
+          <w:lang w:eastAsia="en-GB"/>
+          <w14:ligatures w14:val="none"/>
+        </w:rPr>
+        <w:t>The Code:</w:t>
+      </w:r>
+      <w:r>
+        <w:rPr>
+          <w:rFonts w:ascii="Times New Roman" w:eastAsia="Times New Roman" w:hAnsi="Times New Roman" w:cs="Times New Roman"/>
+          <w:kern w:val="0"/>
+          <w:sz w:val="24"/>
+          <w:szCs w:val="24"/>
+          <w:lang w:eastAsia="en-GB"/>
+          <w14:ligatures w14:val="none"/>
+        </w:rPr>
+        <w:t xml:space="preserve"> In your Django </w:t>
+      </w:r>
+      <w:r>
+        <w:rPr>
+          <w:rFonts w:ascii="Courier New" w:eastAsia="Times New Roman" w:hAnsi="Courier New" w:cs="Courier New"/>
+          <w:kern w:val="0"/>
+          <w:sz w:val="20"/>
+          <w:szCs w:val="20"/>
+          <w:lang w:eastAsia="en-GB"/>
+          <w14:ligatures w14:val="none"/>
+        </w:rPr>
+        <w:t>base.html</w:t>
+      </w:r>
+      <w:r>
+        <w:rPr>
+          <w:rFonts w:ascii="Times New Roman" w:eastAsia="Times New Roman" w:hAnsi="Times New Roman" w:cs="Times New Roman"/>
+          <w:kern w:val="0"/>
+          <w:sz w:val="24"/>
+          <w:szCs w:val="24"/>
+          <w:lang w:eastAsia="en-GB"/>
+          <w14:ligatures w14:val="none"/>
+        </w:rPr>
+        <w:t>:HTML</w:t>
+      </w:r>
+    </w:p>
+    <w:p>
+      <w:pPr>
+        <w:spacing w:before="100" w:beforeAutospacing="1" w:after="100" w:afterAutospacing="1" w:line="240" w:lineRule="auto"/>
+        <w:ind w:left="720"/>
+        <w:rPr>
+          <w:rFonts w:ascii="Times New Roman" w:eastAsia="Times New Roman" w:hAnsi="Times New Roman" w:cs="Times New Roman"/>
+          <w:kern w:val="0"/>
+          <w:sz w:val="24"/>
+          <w:szCs w:val="24"/>
+          <w:lang w:eastAsia="en-GB"/>
+          <w14:ligatures w14:val="none"/>
+        </w:rPr>
+      </w:pPr>
+      <w:r>
+        <w:rPr>
+          <w:rFonts w:ascii="Courier New" w:eastAsia="Times New Roman" w:hAnsi="Courier New" w:cs="Courier New"/>
+          <w:kern w:val="0"/>
+          <w:sz w:val="20"/>
+          <w:szCs w:val="20"/>
+          <w:lang w:eastAsia="en-GB"/>
+          <w14:ligatures w14:val="none"/>
+        </w:rPr>
+        <w:t>&lt;style&gt; [v-cloak], [data-loading] { display: none; } html.loading body { visibility: hidden; } &lt;/style&gt; &lt;script&gt; document.documentElement.classList.add('loading'); window.addEventListener('load', () =&gt; { document.documentElement.classList.remove('loading'); }); &lt;/script&gt;</w:t>
+      </w:r>
+    </w:p>
+    <w:p>
+      <w:pPr>
+        <w:numPr>
+          <w:ilvl w:val="0"/>
+          <w:numId w:val="9"/>
+        </w:numPr>
+        <w:spacing w:before="100" w:beforeAutospacing="1" w:after="100" w:afterAutospacing="1" w:line="240" w:lineRule="auto"/>
+        <w:rPr>
+          <w:rFonts w:ascii="Times New Roman" w:eastAsia="Times New Roman" w:hAnsi="Times New Roman" w:cs="Times New Roman"/>
+          <w:kern w:val="0"/>
+          <w:sz w:val="24"/>
+          <w:szCs w:val="24"/>
+          <w:lang w:eastAsia="en-GB"/>
+          <w14:ligatures w14:val="none"/>
+        </w:rPr>
+      </w:pPr>
+      <w:r>
+        <w:rPr>
+          <w:rFonts w:ascii="Times New Roman" w:eastAsia="Times New Roman" w:hAnsi="Times New Roman" w:cs="Times New Roman"/>
+          <w:b/>
+          <w:bCs/>
+          <w:kern w:val="0"/>
+          <w:sz w:val="24"/>
+          <w:szCs w:val="24"/>
+          <w:lang w:eastAsia="en-GB"/>
+          <w14:ligatures w14:val="none"/>
+        </w:rPr>
+        <w:t>The Logic:</w:t>
+      </w:r>
+      <w:r>
+        <w:rPr>
+          <w:rFonts w:ascii="Times New Roman" w:eastAsia="Times New Roman" w:hAnsi="Times New Roman" w:cs="Times New Roman"/>
+          <w:kern w:val="0"/>
+          <w:sz w:val="24"/>
+          <w:szCs w:val="24"/>
+          <w:lang w:eastAsia="en-GB"/>
+          <w14:ligatures w14:val="none"/>
+        </w:rPr>
+        <w:t xml:space="preserve"> You hide the body instantly, let the SPA mount, and then reveal the finished product. No double flash.</w:t>
+      </w:r>
+    </w:p>
+    <w:p>
+      <w:pPr>
+        <w:spacing w:before="100" w:beforeAutospacing="1" w:after="100" w:afterAutospacing="1" w:line="240" w:lineRule="auto"/>
+        <w:outlineLvl w:val="2"/>
+        <w:rPr>
+          <w:rFonts w:ascii="Times New Roman" w:eastAsia="Times New Roman" w:hAnsi="Times New Roman" w:cs="Times New Roman"/>
+          <w:b/>
+          <w:bCs/>
+          <w:kern w:val="0"/>
+          <w:sz w:val="27"/>
+          <w:szCs w:val="27"/>
+          <w:lang w:eastAsia="en-GB"/>
+          <w14:ligatures w14:val="none"/>
+        </w:rPr>
+      </w:pPr>
+      <w:r>
+        <w:rPr>
+          <w:rFonts w:ascii="Times New Roman" w:eastAsia="Times New Roman" w:hAnsi="Times New Roman" w:cs="Times New Roman"/>
+          <w:b/>
+          <w:bCs/>
+          <w:kern w:val="0"/>
+          <w:sz w:val="27"/>
+          <w:szCs w:val="27"/>
+          <w:lang w:eastAsia="en-GB"/>
+          <w14:ligatures w14:val="none"/>
+        </w:rPr>
+        <w:t>B. Server-Side Rendering (SSR) / Inertia.js</w:t>
+      </w:r>
+    </w:p>
+    <w:p>
+      <w:pPr>
+        <w:spacing w:before="100" w:beforeAutospacing="1" w:after="100" w:afterAutospacing="1" w:line="240" w:lineRule="auto"/>
+        <w:rPr>
+          <w:rFonts w:ascii="Times New Roman" w:eastAsia="Times New Roman" w:hAnsi="Times New Roman" w:cs="Times New Roman"/>
+          <w:kern w:val="0"/>
+          <w:sz w:val="24"/>
+          <w:szCs w:val="24"/>
+          <w:lang w:eastAsia="en-GB"/>
+          <w14:ligatures w14:val="none"/>
+        </w:rPr>
+      </w:pPr>
+      <w:r>
+        <w:rPr>
+          <w:rFonts w:ascii="Times New Roman" w:eastAsia="Times New Roman" w:hAnsi="Times New Roman" w:cs="Times New Roman"/>
+          <w:kern w:val="0"/>
+          <w:sz w:val="24"/>
+          <w:szCs w:val="24"/>
+          <w:lang w:eastAsia="en-GB"/>
+          <w14:ligatures w14:val="none"/>
+        </w:rPr>
+        <w:t>If you want a truly "competitive" app, you shouldn't let Django render the body at all.</w:t>
+      </w:r>
+    </w:p>
+    <w:p>
+      <w:pPr>
+        <w:numPr>
+          <w:ilvl w:val="0"/>
+          <w:numId w:val="10"/>
+        </w:numPr>
+        <w:spacing w:before="100" w:beforeAutospacing="1" w:after="100" w:afterAutospacing="1" w:line="240" w:lineRule="auto"/>
+        <w:rPr>
+          <w:rFonts w:ascii="Times New Roman" w:eastAsia="Times New Roman" w:hAnsi="Times New Roman" w:cs="Times New Roman"/>
+          <w:kern w:val="0"/>
+          <w:sz w:val="24"/>
+          <w:szCs w:val="24"/>
+          <w:lang w:eastAsia="en-GB"/>
+          <w14:ligatures w14:val="none"/>
+        </w:rPr>
+      </w:pPr>
+      <w:r>
+        <w:rPr>
+          <w:rFonts w:ascii="Times New Roman" w:eastAsia="Times New Roman" w:hAnsi="Times New Roman" w:cs="Times New Roman"/>
+          <w:b/>
+          <w:bCs/>
+          <w:kern w:val="0"/>
+          <w:sz w:val="24"/>
+          <w:szCs w:val="24"/>
+          <w:lang w:eastAsia="en-GB"/>
+          <w14:ligatures w14:val="none"/>
+        </w:rPr>
+        <w:t>The Gold Standard:</w:t>
+      </w:r>
+      <w:r>
+        <w:rPr>
+          <w:rFonts w:ascii="Times New Roman" w:eastAsia="Times New Roman" w:hAnsi="Times New Roman" w:cs="Times New Roman"/>
+          <w:kern w:val="0"/>
+          <w:sz w:val="24"/>
+          <w:szCs w:val="24"/>
+          <w:lang w:eastAsia="en-GB"/>
+          <w14:ligatures w14:val="none"/>
+        </w:rPr>
+        <w:t xml:space="preserve"> Use </w:t>
+      </w:r>
+      <w:r>
+        <w:rPr>
+          <w:rFonts w:ascii="Times New Roman" w:eastAsia="Times New Roman" w:hAnsi="Times New Roman" w:cs="Times New Roman"/>
+          <w:b/>
+          <w:bCs/>
+          <w:kern w:val="0"/>
+          <w:sz w:val="24"/>
+          <w:szCs w:val="24"/>
+          <w:lang w:eastAsia="en-GB"/>
+          <w14:ligatures w14:val="none"/>
+        </w:rPr>
+        <w:t>Inertia.js</w:t>
+      </w:r>
+      <w:r>
+        <w:rPr>
+          <w:rFonts w:ascii="Times New Roman" w:eastAsia="Times New Roman" w:hAnsi="Times New Roman" w:cs="Times New Roman"/>
+          <w:kern w:val="0"/>
+          <w:sz w:val="24"/>
+          <w:szCs w:val="24"/>
+          <w:lang w:eastAsia="en-GB"/>
+          <w14:ligatures w14:val="none"/>
+        </w:rPr>
+        <w:t xml:space="preserve"> with Django.</w:t>
+      </w:r>
+    </w:p>
+    <w:p>
+      <w:pPr>
+        <w:numPr>
+          <w:ilvl w:val="0"/>
+          <w:numId w:val="10"/>
+        </w:numPr>
+        <w:spacing w:before="100" w:beforeAutospacing="1" w:after="100" w:afterAutospacing="1" w:line="240" w:lineRule="auto"/>
+        <w:rPr>
+          <w:rFonts w:ascii="Times New Roman" w:eastAsia="Times New Roman" w:hAnsi="Times New Roman" w:cs="Times New Roman"/>
+          <w:kern w:val="0"/>
+          <w:sz w:val="24"/>
+          <w:szCs w:val="24"/>
+          <w:lang w:eastAsia="en-GB"/>
+          <w14:ligatures w14:val="none"/>
+        </w:rPr>
+      </w:pPr>
+      <w:r>
+        <w:rPr>
+          <w:rFonts w:ascii="Times New Roman" w:eastAsia="Times New Roman" w:hAnsi="Times New Roman" w:cs="Times New Roman"/>
+          <w:b/>
+          <w:bCs/>
+          <w:kern w:val="0"/>
+          <w:sz w:val="24"/>
+          <w:szCs w:val="24"/>
+          <w:lang w:eastAsia="en-GB"/>
+          <w14:ligatures w14:val="none"/>
+        </w:rPr>
+        <w:t>How it works:</w:t>
+      </w:r>
+      <w:r>
+        <w:rPr>
+          <w:rFonts w:ascii="Times New Roman" w:eastAsia="Times New Roman" w:hAnsi="Times New Roman" w:cs="Times New Roman"/>
+          <w:kern w:val="0"/>
+          <w:sz w:val="24"/>
+          <w:szCs w:val="24"/>
+          <w:lang w:eastAsia="en-GB"/>
+          <w14:ligatures w14:val="none"/>
+        </w:rPr>
+        <w:t xml:space="preserve"> Django sends a JSON object to a "Root" component. The SPA renders the page based on that JSON. Because the SPA is the </w:t>
+      </w:r>
+      <w:r>
+        <w:rPr>
+          <w:rFonts w:ascii="Times New Roman" w:eastAsia="Times New Roman" w:hAnsi="Times New Roman" w:cs="Times New Roman"/>
+          <w:i/>
+          <w:iCs/>
+          <w:kern w:val="0"/>
+          <w:sz w:val="24"/>
+          <w:szCs w:val="24"/>
+          <w:lang w:eastAsia="en-GB"/>
+          <w14:ligatures w14:val="none"/>
+        </w:rPr>
+        <w:t>only</w:t>
+      </w:r>
+      <w:r>
+        <w:rPr>
+          <w:rFonts w:ascii="Times New Roman" w:eastAsia="Times New Roman" w:hAnsi="Times New Roman" w:cs="Times New Roman"/>
+          <w:kern w:val="0"/>
+          <w:sz w:val="24"/>
+          <w:szCs w:val="24"/>
+          <w:lang w:eastAsia="en-GB"/>
+          <w14:ligatures w14:val="none"/>
+        </w:rPr>
+        <w:t xml:space="preserve"> thing rendering the content, there is no "hand-off" or "double-draw."</w:t>
+      </w:r>
+    </w:p>
+    <w:p>
+      <w:pPr>
+        <w:spacing w:before="100" w:beforeAutospacing="1" w:after="100" w:afterAutospacing="1" w:line="240" w:lineRule="auto"/>
+        <w:outlineLvl w:val="2"/>
+        <w:rPr>
+          <w:rFonts w:ascii="Times New Roman" w:eastAsia="Times New Roman" w:hAnsi="Times New Roman" w:cs="Times New Roman"/>
+          <w:b/>
+          <w:bCs/>
+          <w:kern w:val="0"/>
+          <w:sz w:val="27"/>
+          <w:szCs w:val="27"/>
+          <w:lang w:eastAsia="en-GB"/>
+          <w14:ligatures w14:val="none"/>
+        </w:rPr>
+      </w:pPr>
+      <w:r>
+        <w:rPr>
+          <w:rFonts w:ascii="Times New Roman" w:eastAsia="Times New Roman" w:hAnsi="Times New Roman" w:cs="Times New Roman"/>
+          <w:b/>
+          <w:bCs/>
+          <w:kern w:val="0"/>
+          <w:sz w:val="27"/>
+          <w:szCs w:val="27"/>
+          <w:lang w:eastAsia="en-GB"/>
+          <w14:ligatures w14:val="none"/>
+        </w:rPr>
+        <w:t>C. Match the "Initial State" (The "Hydration" Fix)</w:t>
+      </w:r>
+    </w:p>
+    <w:p>
+      <w:pPr>
+        <w:spacing w:before="100" w:beforeAutospacing="1" w:after="100" w:afterAutospacing="1" w:line="240" w:lineRule="auto"/>
+        <w:rPr>
+          <w:rFonts w:ascii="Times New Roman" w:eastAsia="Times New Roman" w:hAnsi="Times New Roman" w:cs="Times New Roman"/>
+          <w:kern w:val="0"/>
+          <w:sz w:val="24"/>
+          <w:szCs w:val="24"/>
+          <w:lang w:eastAsia="en-GB"/>
+          <w14:ligatures w14:val="none"/>
+        </w:rPr>
+      </w:pPr>
+      <w:r>
+        <w:rPr>
+          <w:rFonts w:ascii="Times New Roman" w:eastAsia="Times New Roman" w:hAnsi="Times New Roman" w:cs="Times New Roman"/>
+          <w:kern w:val="0"/>
+          <w:sz w:val="24"/>
+          <w:szCs w:val="24"/>
+          <w:lang w:eastAsia="en-GB"/>
+          <w14:ligatures w14:val="none"/>
+        </w:rPr>
+        <w:lastRenderedPageBreak/>
+        <w:t>If you are using a framework like React, the "flash" often happens because your SPA starts with a "Loading..." state while fetching data.</w:t>
+      </w:r>
+    </w:p>
+    <w:p>
+      <w:pPr>
+        <w:numPr>
+          <w:ilvl w:val="0"/>
+          <w:numId w:val="11"/>
+        </w:numPr>
+        <w:spacing w:before="100" w:beforeAutospacing="1" w:after="100" w:afterAutospacing="1" w:line="240" w:lineRule="auto"/>
+        <w:rPr>
+          <w:rFonts w:ascii="Times New Roman" w:eastAsia="Times New Roman" w:hAnsi="Times New Roman" w:cs="Times New Roman"/>
+          <w:kern w:val="0"/>
+          <w:sz w:val="24"/>
+          <w:szCs w:val="24"/>
+          <w:lang w:eastAsia="en-GB"/>
+          <w14:ligatures w14:val="none"/>
+        </w:rPr>
+      </w:pPr>
+      <w:r>
+        <w:rPr>
+          <w:rFonts w:ascii="Times New Roman" w:eastAsia="Times New Roman" w:hAnsi="Times New Roman" w:cs="Times New Roman"/>
+          <w:b/>
+          <w:bCs/>
+          <w:kern w:val="0"/>
+          <w:sz w:val="24"/>
+          <w:szCs w:val="24"/>
+          <w:lang w:eastAsia="en-GB"/>
+          <w14:ligatures w14:val="none"/>
+        </w:rPr>
+        <w:t>Fix:</w:t>
+      </w:r>
+      <w:r>
+        <w:rPr>
+          <w:rFonts w:ascii="Times New Roman" w:eastAsia="Times New Roman" w:hAnsi="Times New Roman" w:cs="Times New Roman"/>
+          <w:kern w:val="0"/>
+          <w:sz w:val="24"/>
+          <w:szCs w:val="24"/>
+          <w:lang w:eastAsia="en-GB"/>
+          <w14:ligatures w14:val="none"/>
+        </w:rPr>
+        <w:t xml:space="preserve"> </w:t>
+      </w:r>
+      <w:r>
+        <w:rPr>
+          <w:rFonts w:ascii="Times New Roman" w:eastAsia="Times New Roman" w:hAnsi="Times New Roman" w:cs="Times New Roman"/>
+          <w:b/>
+          <w:bCs/>
+          <w:kern w:val="0"/>
+          <w:sz w:val="24"/>
+          <w:szCs w:val="24"/>
+          <w:lang w:eastAsia="en-GB"/>
+          <w14:ligatures w14:val="none"/>
+        </w:rPr>
+        <w:t>Inject the data into the HTML.</w:t>
+      </w:r>
+      <w:r>
+        <w:rPr>
+          <w:rFonts w:ascii="Times New Roman" w:eastAsia="Times New Roman" w:hAnsi="Times New Roman" w:cs="Times New Roman"/>
+          <w:kern w:val="0"/>
+          <w:sz w:val="24"/>
+          <w:szCs w:val="24"/>
+          <w:lang w:eastAsia="en-GB"/>
+          <w14:ligatures w14:val="none"/>
+        </w:rPr>
+        <w:t xml:space="preserve"> Don't make an AJAX call for the user's name/feed on page load.</w:t>
+      </w:r>
+    </w:p>
+    <w:p>
+      <w:pPr>
+        <w:numPr>
+          <w:ilvl w:val="0"/>
+          <w:numId w:val="11"/>
+        </w:numPr>
+        <w:spacing w:before="100" w:beforeAutospacing="1" w:after="100" w:afterAutospacing="1" w:line="240" w:lineRule="auto"/>
+        <w:rPr>
+          <w:rFonts w:ascii="Times New Roman" w:eastAsia="Times New Roman" w:hAnsi="Times New Roman" w:cs="Times New Roman"/>
+          <w:kern w:val="0"/>
+          <w:sz w:val="24"/>
+          <w:szCs w:val="24"/>
+          <w:lang w:eastAsia="en-GB"/>
+          <w14:ligatures w14:val="none"/>
+        </w:rPr>
+      </w:pPr>
+      <w:r>
+        <w:rPr>
+          <w:rFonts w:ascii="Times New Roman" w:eastAsia="Times New Roman" w:hAnsi="Times New Roman" w:cs="Times New Roman"/>
+          <w:kern w:val="0"/>
+          <w:sz w:val="24"/>
+          <w:szCs w:val="24"/>
+          <w:lang w:eastAsia="en-GB"/>
+          <w14:ligatures w14:val="none"/>
+        </w:rPr>
+        <w:t>**Django Template:**HTML</w:t>
+      </w:r>
+    </w:p>
+    <w:p>
+      <w:pPr>
+        <w:spacing w:before="100" w:beforeAutospacing="1" w:after="100" w:afterAutospacing="1" w:line="240" w:lineRule="auto"/>
+        <w:ind w:left="720"/>
+        <w:rPr>
+          <w:rFonts w:ascii="Times New Roman" w:eastAsia="Times New Roman" w:hAnsi="Times New Roman" w:cs="Times New Roman"/>
+          <w:kern w:val="0"/>
+          <w:sz w:val="24"/>
+          <w:szCs w:val="24"/>
+          <w:lang w:eastAsia="en-GB"/>
+          <w14:ligatures w14:val="none"/>
+        </w:rPr>
+      </w:pPr>
+      <w:r>
+        <w:rPr>
+          <w:rFonts w:ascii="Courier New" w:eastAsia="Times New Roman" w:hAnsi="Courier New" w:cs="Courier New"/>
+          <w:kern w:val="0"/>
+          <w:sz w:val="20"/>
+          <w:szCs w:val="20"/>
+          <w:lang w:eastAsia="en-GB"/>
+          <w14:ligatures w14:val="none"/>
+        </w:rPr>
+        <w:t>&lt;script id="initial-data" type="application/json"&gt; {{ user_data_json|safe }} &lt;/script&gt;</w:t>
+      </w:r>
+    </w:p>
+    <w:p>
+      <w:pPr>
+        <w:numPr>
+          <w:ilvl w:val="0"/>
+          <w:numId w:val="11"/>
+        </w:numPr>
+        <w:spacing w:before="100" w:beforeAutospacing="1" w:after="100" w:afterAutospacing="1" w:line="240" w:lineRule="auto"/>
+        <w:rPr>
+          <w:rFonts w:ascii="Times New Roman" w:eastAsia="Times New Roman" w:hAnsi="Times New Roman" w:cs="Times New Roman"/>
+          <w:kern w:val="0"/>
+          <w:sz w:val="24"/>
+          <w:szCs w:val="24"/>
+          <w:lang w:eastAsia="en-GB"/>
+          <w14:ligatures w14:val="none"/>
+        </w:rPr>
+      </w:pPr>
+      <w:r>
+        <w:rPr>
+          <w:rFonts w:ascii="Times New Roman" w:eastAsia="Times New Roman" w:hAnsi="Times New Roman" w:cs="Times New Roman"/>
+          <w:b/>
+          <w:bCs/>
+          <w:kern w:val="0"/>
+          <w:sz w:val="24"/>
+          <w:szCs w:val="24"/>
+          <w:lang w:eastAsia="en-GB"/>
+          <w14:ligatures w14:val="none"/>
+        </w:rPr>
+        <w:t>SPA Logic:</w:t>
+      </w:r>
+      <w:r>
+        <w:rPr>
+          <w:rFonts w:ascii="Times New Roman" w:eastAsia="Times New Roman" w:hAnsi="Times New Roman" w:cs="Times New Roman"/>
+          <w:kern w:val="0"/>
+          <w:sz w:val="24"/>
+          <w:szCs w:val="24"/>
+          <w:lang w:eastAsia="en-GB"/>
+          <w14:ligatures w14:val="none"/>
+        </w:rPr>
+        <w:t xml:space="preserve"> Make your SPA read this </w:t>
+      </w:r>
+      <w:r>
+        <w:rPr>
+          <w:rFonts w:ascii="Courier New" w:eastAsia="Times New Roman" w:hAnsi="Courier New" w:cs="Courier New"/>
+          <w:kern w:val="0"/>
+          <w:sz w:val="20"/>
+          <w:szCs w:val="20"/>
+          <w:lang w:eastAsia="en-GB"/>
+          <w14:ligatures w14:val="none"/>
+        </w:rPr>
+        <w:t>&lt;script&gt;</w:t>
+      </w:r>
+      <w:r>
+        <w:rPr>
+          <w:rFonts w:ascii="Times New Roman" w:eastAsia="Times New Roman" w:hAnsi="Times New Roman" w:cs="Times New Roman"/>
+          <w:kern w:val="0"/>
+          <w:sz w:val="24"/>
+          <w:szCs w:val="24"/>
+          <w:lang w:eastAsia="en-GB"/>
+          <w14:ligatures w14:val="none"/>
+        </w:rPr>
+        <w:t xml:space="preserve"> tag immediately upon boot. If the data is there instantly, the SPA won't show a "loading" flash.</w:t>
+      </w:r>
+    </w:p>
+    <w:p>
+      <w:pPr>
+        <w:spacing w:after="0" w:line="240" w:lineRule="auto"/>
+        <w:rPr>
+          <w:rFonts w:ascii="Times New Roman" w:eastAsia="Times New Roman" w:hAnsi="Times New Roman" w:cs="Times New Roman"/>
+          <w:kern w:val="0"/>
+          <w:sz w:val="24"/>
+          <w:szCs w:val="24"/>
+          <w:lang w:eastAsia="en-GB"/>
+          <w14:ligatures w14:val="none"/>
+        </w:rPr>
+      </w:pPr>
+      <w:r>
+        <w:rPr>
+          <w:rFonts w:ascii="Times New Roman" w:eastAsia="Times New Roman" w:hAnsi="Times New Roman" w:cs="Times New Roman"/>
+          <w:kern w:val="0"/>
+          <w:sz w:val="24"/>
+          <w:szCs w:val="24"/>
+          <w:lang w:eastAsia="en-GB"/>
+          <w14:ligatures w14:val="none"/>
+        </w:rPr>
+        <w:pict w14:anchorId="225B565C">
+          <v:rect id="_x0000_i1027" style="width:0;height:1.5pt" o:hralign="center" o:hrstd="t" o:hr="t" fillcolor="#a0a0a0" stroked="f"/>
+        </w:pict>
+      </w:r>
+    </w:p>
+    <w:p>
+      <w:pPr>
+        <w:spacing w:before="100" w:beforeAutospacing="1" w:after="100" w:afterAutospacing="1" w:line="240" w:lineRule="auto"/>
+        <w:outlineLvl w:val="2"/>
+        <w:rPr>
+          <w:rFonts w:ascii="Times New Roman" w:eastAsia="Times New Roman" w:hAnsi="Times New Roman" w:cs="Times New Roman"/>
+          <w:b/>
+          <w:bCs/>
+          <w:kern w:val="0"/>
+          <w:sz w:val="27"/>
+          <w:szCs w:val="27"/>
+          <w:lang w:eastAsia="en-GB"/>
+          <w14:ligatures w14:val="none"/>
+        </w:rPr>
+      </w:pPr>
+      <w:r>
+        <w:rPr>
+          <w:rFonts w:ascii="Times New Roman" w:eastAsia="Times New Roman" w:hAnsi="Times New Roman" w:cs="Times New Roman"/>
+          <w:b/>
+          <w:bCs/>
+          <w:kern w:val="0"/>
+          <w:sz w:val="27"/>
+          <w:szCs w:val="27"/>
+          <w:lang w:eastAsia="en-GB"/>
+          <w14:ligatures w14:val="none"/>
+        </w:rPr>
+        <w:t>3. Professional Architecture Check</w:t>
+      </w:r>
+    </w:p>
+    <w:p>
+      <w:pPr>
+        <w:spacing w:before="100" w:beforeAutospacing="1" w:after="100" w:afterAutospacing="1" w:line="240" w:lineRule="auto"/>
+        <w:rPr>
+          <w:rFonts w:ascii="Times New Roman" w:eastAsia="Times New Roman" w:hAnsi="Times New Roman" w:cs="Times New Roman"/>
+          <w:kern w:val="0"/>
+          <w:sz w:val="24"/>
+          <w:szCs w:val="24"/>
+          <w:lang w:eastAsia="en-GB"/>
+          <w14:ligatures w14:val="none"/>
+        </w:rPr>
+      </w:pPr>
+      <w:r>
+        <w:rPr>
+          <w:rFonts w:ascii="Times New Roman" w:eastAsia="Times New Roman" w:hAnsi="Times New Roman" w:cs="Times New Roman"/>
+          <w:kern w:val="0"/>
+          <w:sz w:val="24"/>
+          <w:szCs w:val="24"/>
+          <w:lang w:eastAsia="en-GB"/>
+          <w14:ligatures w14:val="none"/>
+        </w:rPr>
+        <w:t xml:space="preserve">Are you using </w:t>
+      </w:r>
+      <w:r>
+        <w:rPr>
+          <w:rFonts w:ascii="Times New Roman" w:eastAsia="Times New Roman" w:hAnsi="Times New Roman" w:cs="Times New Roman"/>
+          <w:b/>
+          <w:bCs/>
+          <w:kern w:val="0"/>
+          <w:sz w:val="24"/>
+          <w:szCs w:val="24"/>
+          <w:lang w:eastAsia="en-GB"/>
+          <w14:ligatures w14:val="none"/>
+        </w:rPr>
+        <w:t>Vite</w:t>
+      </w:r>
+      <w:r>
+        <w:rPr>
+          <w:rFonts w:ascii="Times New Roman" w:eastAsia="Times New Roman" w:hAnsi="Times New Roman" w:cs="Times New Roman"/>
+          <w:kern w:val="0"/>
+          <w:sz w:val="24"/>
+          <w:szCs w:val="24"/>
+          <w:lang w:eastAsia="en-GB"/>
+          <w14:ligatures w14:val="none"/>
+        </w:rPr>
+        <w:t xml:space="preserve"> with Django? If not, that is likely your secondary bottleneck. Vite handles "Hot Module Replacement" and CSS injection much faster than older methods, reducing the time between the Django render and the SPA takeover.</w:t>
+      </w:r>
+    </w:p>
+    <w:p>
+      <w:pPr>
+        <w:spacing w:before="100" w:beforeAutospacing="1" w:after="100" w:afterAutospacing="1" w:line="240" w:lineRule="auto"/>
+        <w:rPr>
+          <w:rFonts w:ascii="Times New Roman" w:eastAsia="Times New Roman" w:hAnsi="Times New Roman" w:cs="Times New Roman"/>
+          <w:kern w:val="0"/>
+          <w:sz w:val="24"/>
+          <w:szCs w:val="24"/>
+          <w:lang w:eastAsia="en-GB"/>
+          <w14:ligatures w14:val="none"/>
+        </w:rPr>
+      </w:pPr>
+      <w:r>
+        <w:rPr>
+          <w:rFonts w:ascii="Times New Roman" w:eastAsia="Times New Roman" w:hAnsi="Times New Roman" w:cs="Times New Roman"/>
+          <w:b/>
+          <w:bCs/>
+          <w:kern w:val="0"/>
+          <w:sz w:val="24"/>
+          <w:szCs w:val="24"/>
+          <w:lang w:eastAsia="en-GB"/>
+          <w14:ligatures w14:val="none"/>
+        </w:rPr>
+        <w:t>Which of these describes your setup?</w:t>
+      </w:r>
+    </w:p>
+    <w:p>
+      <w:pPr>
+        <w:numPr>
+          <w:ilvl w:val="0"/>
+          <w:numId w:val="12"/>
+        </w:numPr>
+        <w:spacing w:before="100" w:beforeAutospacing="1" w:after="100" w:afterAutospacing="1" w:line="240" w:lineRule="auto"/>
+        <w:rPr>
+          <w:rFonts w:ascii="Times New Roman" w:eastAsia="Times New Roman" w:hAnsi="Times New Roman" w:cs="Times New Roman"/>
+          <w:kern w:val="0"/>
+          <w:sz w:val="24"/>
+          <w:szCs w:val="24"/>
+          <w:lang w:eastAsia="en-GB"/>
+          <w14:ligatures w14:val="none"/>
+        </w:rPr>
+      </w:pPr>
+      <w:r>
+        <w:rPr>
+          <w:rFonts w:ascii="Times New Roman" w:eastAsia="Times New Roman" w:hAnsi="Times New Roman" w:cs="Times New Roman"/>
+          <w:kern w:val="0"/>
+          <w:sz w:val="24"/>
+          <w:szCs w:val="24"/>
+          <w:lang w:eastAsia="en-GB"/>
+          <w14:ligatures w14:val="none"/>
+        </w:rPr>
+        <w:t>Django templates with "islands" of React/Vue inside them?</w:t>
+      </w:r>
+    </w:p>
+    <w:p>
+      <w:pPr>
+        <w:numPr>
+          <w:ilvl w:val="0"/>
+          <w:numId w:val="12"/>
+        </w:numPr>
+        <w:spacing w:before="100" w:beforeAutospacing="1" w:after="100" w:afterAutospacing="1" w:line="240" w:lineRule="auto"/>
+        <w:rPr>
+          <w:rFonts w:ascii="Times New Roman" w:eastAsia="Times New Roman" w:hAnsi="Times New Roman" w:cs="Times New Roman"/>
+          <w:kern w:val="0"/>
+          <w:sz w:val="24"/>
+          <w:szCs w:val="24"/>
+          <w:lang w:eastAsia="en-GB"/>
+          <w14:ligatures w14:val="none"/>
+        </w:rPr>
+      </w:pPr>
+      <w:r>
+        <w:rPr>
+          <w:rFonts w:ascii="Times New Roman" w:eastAsia="Times New Roman" w:hAnsi="Times New Roman" w:cs="Times New Roman"/>
+          <w:kern w:val="0"/>
+          <w:sz w:val="24"/>
+          <w:szCs w:val="24"/>
+          <w:lang w:eastAsia="en-GB"/>
+          <w14:ligatures w14:val="none"/>
+        </w:rPr>
+        <w:t xml:space="preserve">A full React/Vue app where Django only provides the </w:t>
+      </w:r>
+      <w:r>
+        <w:rPr>
+          <w:rFonts w:ascii="Courier New" w:eastAsia="Times New Roman" w:hAnsi="Courier New" w:cs="Courier New"/>
+          <w:kern w:val="0"/>
+          <w:sz w:val="20"/>
+          <w:szCs w:val="20"/>
+          <w:lang w:eastAsia="en-GB"/>
+          <w14:ligatures w14:val="none"/>
+        </w:rPr>
+        <w:t>/api/</w:t>
+      </w:r>
+      <w:r>
+        <w:rPr>
+          <w:rFonts w:ascii="Times New Roman" w:eastAsia="Times New Roman" w:hAnsi="Times New Roman" w:cs="Times New Roman"/>
+          <w:kern w:val="0"/>
+          <w:sz w:val="24"/>
+          <w:szCs w:val="24"/>
+          <w:lang w:eastAsia="en-GB"/>
+          <w14:ligatures w14:val="none"/>
+        </w:rPr>
+        <w:t xml:space="preserve"> and the initial </w:t>
+      </w:r>
+      <w:r>
+        <w:rPr>
+          <w:rFonts w:ascii="Courier New" w:eastAsia="Times New Roman" w:hAnsi="Courier New" w:cs="Courier New"/>
+          <w:kern w:val="0"/>
+          <w:sz w:val="20"/>
+          <w:szCs w:val="20"/>
+          <w:lang w:eastAsia="en-GB"/>
+          <w14:ligatures w14:val="none"/>
+        </w:rPr>
+        <w:t>index.html</w:t>
+      </w:r>
+      <w:r>
+        <w:rPr>
+          <w:rFonts w:ascii="Times New Roman" w:eastAsia="Times New Roman" w:hAnsi="Times New Roman" w:cs="Times New Roman"/>
+          <w:kern w:val="0"/>
+          <w:sz w:val="24"/>
+          <w:szCs w:val="24"/>
+          <w:lang w:eastAsia="en-GB"/>
+          <w14:ligatures w14:val="none"/>
+        </w:rPr>
+        <w:t>?</w:t>
+      </w:r>
+    </w:p>
+    <w:p>
+      <w:pPr>
+        <w:spacing w:before="100" w:beforeAutospacing="1" w:after="100" w:afterAutospacing="1" w:line="240" w:lineRule="auto"/>
+        <w:rPr>
+          <w:rFonts w:ascii="Times New Roman" w:eastAsia="Times New Roman" w:hAnsi="Times New Roman" w:cs="Times New Roman"/>
+          <w:kern w:val="0"/>
+          <w:sz w:val="24"/>
+          <w:szCs w:val="24"/>
+          <w:lang w:eastAsia="en-GB"/>
+          <w14:ligatures w14:val="none"/>
+        </w:rPr>
+      </w:pPr>
+      <w:r>
+        <w:rPr>
+          <w:rFonts w:ascii="Times New Roman" w:eastAsia="Times New Roman" w:hAnsi="Times New Roman" w:cs="Times New Roman"/>
+          <w:kern w:val="0"/>
+          <w:sz w:val="24"/>
+          <w:szCs w:val="24"/>
+          <w:lang w:eastAsia="en-GB"/>
+          <w14:ligatures w14:val="none"/>
+        </w:rPr>
+        <w:t xml:space="preserve">(The fix for #1 is CSS-based; the fix for #2 is usually about </w:t>
+      </w:r>
+      <w:r>
+        <w:rPr>
+          <w:rFonts w:ascii="Times New Roman" w:eastAsia="Times New Roman" w:hAnsi="Times New Roman" w:cs="Times New Roman"/>
+          <w:b/>
+          <w:bCs/>
+          <w:kern w:val="0"/>
+          <w:sz w:val="24"/>
+          <w:szCs w:val="24"/>
+          <w:lang w:eastAsia="en-GB"/>
+          <w14:ligatures w14:val="none"/>
+        </w:rPr>
+        <w:t>Hydration</w:t>
+      </w:r>
+      <w:r>
+        <w:rPr>
+          <w:rFonts w:ascii="Times New Roman" w:eastAsia="Times New Roman" w:hAnsi="Times New Roman" w:cs="Times New Roman"/>
+          <w:kern w:val="0"/>
+          <w:sz w:val="24"/>
+          <w:szCs w:val="24"/>
+          <w:lang w:eastAsia="en-GB"/>
+          <w14:ligatures w14:val="none"/>
+        </w:rPr>
+        <w:t xml:space="preserve"> and </w:t>
+      </w:r>
+      <w:r>
+        <w:rPr>
+          <w:rFonts w:ascii="Times New Roman" w:eastAsia="Times New Roman" w:hAnsi="Times New Roman" w:cs="Times New Roman"/>
+          <w:b/>
+          <w:bCs/>
+          <w:kern w:val="0"/>
+          <w:sz w:val="24"/>
+          <w:szCs w:val="24"/>
+          <w:lang w:eastAsia="en-GB"/>
+          <w14:ligatures w14:val="none"/>
+        </w:rPr>
+        <w:t>SSR</w:t>
+      </w:r>
+      <w:r>
+        <w:rPr>
+          <w:rFonts w:ascii="Times New Roman" w:eastAsia="Times New Roman" w:hAnsi="Times New Roman" w:cs="Times New Roman"/>
+          <w:kern w:val="0"/>
+          <w:sz w:val="24"/>
+          <w:szCs w:val="24"/>
+          <w:lang w:eastAsia="en-GB"/>
+          <w14:ligatures w14:val="none"/>
+        </w:rPr>
+        <w:t>).</w:t>
+      </w:r>
+    </w:p>
+    <w:p>
+      <w:r>
+        <w:t>s</w:t>
+      </w:r>
+    </w:p>
     <w:sectPr>
       <w:pgSz w:w="11906" w:h="16838"/>
       <w:pgMar w:top="1440" w:right="1440" w:bottom="1440" w:left="1440" w:header="708" w:footer="708" w:gutter="0"/>
@@ -2939,6 +5125,453 @@
 <file path=word/numbering.xml><?xml version="1.0" encoding="utf-8"?>
 <w:numbering xmlns:wpc="http://schemas.microsoft.com/office/word/2010/wordprocessingCanvas" xmlns:cx="http://schemas.microsoft.com/office/drawing/2014/chartex" xmlns:cx1="http://schemas.microsoft.com/office/drawing/2015/9/8/chartex" xmlns:cx2="http://schemas.microsoft.com/office/drawing/2015/10/21/chartex" xmlns:cx3="http://schemas.microsoft.com/office/drawing/2016/5/9/chartex" xmlns:cx4="http://schemas.microsoft.com/office/drawing/2016/5/10/chartex" xmlns:cx5="http://schemas.microsoft.com/office/drawing/2016/5/11/chartex" xmlns:cx6="http://schemas.microsoft.com/office/drawing/2016/5/12/chartex" xmlns:cx7="http://schemas.microsoft.com/office/drawing/2016/5/13/chartex" xmlns:cx8="http://schemas.microsoft.com/office/drawing/2016/5/14/chartex" xmlns:mc="http://schemas.openxmlformats.org/markup-compatibility/2006" xmlns:aink="http://schemas.microsoft.com/office/drawing/2016/ink" xmlns:am3d="http://schemas.microsoft.com/office/drawing/2017/model3d" xmlns:o="urn:schemas-microsoft-com:office:office" xmlns:oel="http://schemas.microsoft.com/office/2019/extlst" xmlns:r="http://schemas.openxmlformats.org/officeDocument/2006/relationships" xmlns:m="http://schemas.openxmlformats.org/officeDocument/2006/math" xmlns:v="urn:schemas-microsoft-com:vml" xmlns:wp14="http://schemas.microsoft.com/office/word/2010/wordprocessingDrawing" xmlns:wp="http://schemas.openxmlformats.org/drawingml/2006/wordprocessingDrawing" xmlns:w10="urn:schemas-microsoft-com:office:word" xmlns:w="http://schemas.openxmlformats.org/wordprocessingml/2006/main" xmlns:w14="http://schemas.microsoft.com/office/word/2010/wordml" xmlns:w15="http://schemas.microsoft.com/office/word/2012/wordml" xmlns:w16cex="http://schemas.microsoft.com/office/word/2018/wordml/cex" xmlns:w16cid="http://schemas.microsoft.com/office/word/2016/wordml/cid" xmlns:w16="http://schemas.microsoft.com/office/word/2018/wordml" xmlns:w16du="http://schemas.microsoft.com/office/word/2023/wordml/word16du" xmlns:w16sdtdh="http://schemas.microsoft.com/office/word/2020/wordml/sdtdatahash" xmlns:w16sdtfl="http://schemas.microsoft.com/office/word/2024/wordml/sdtformatlock" xmlns:w16se="http://schemas.microsoft.com/office/word/2015/wordml/symex" xmlns:wpg="http://schemas.microsoft.com/office/word/2010/wordprocessingGroup" xmlns:wpi="http://schemas.microsoft.com/office/word/2010/wordprocessingInk" xmlns:wne="http://schemas.microsoft.com/office/word/2006/wordml" xmlns:wps="http://schemas.microsoft.com/office/word/2010/wordprocessingShape" mc:Ignorable="w14 w15 w16se w16cid w16 w16cex w16sdtdh w16sdtfl w16du wp14">
   <w:abstractNum w:abstractNumId="0" w15:restartNumberingAfterBreak="0">
+    <w:nsid w:val="03F45F55"/>
+    <w:multiLevelType w:val="multilevel"/>
+    <w:tmpl w:val="2690D812"/>
+    <w:lvl w:ilvl="0">
+      <w:start w:val="1"/>
+      <w:numFmt w:val="bullet"/>
+      <w:lvlText w:val=""/>
+      <w:lvlJc w:val="left"/>
+      <w:pPr>
+        <w:tabs>
+          <w:tab w:val="num" w:pos="720"/>
+        </w:tabs>
+        <w:ind w:left="720" w:hanging="360"/>
+      </w:pPr>
+      <w:rPr>
+        <w:rFonts w:ascii="Symbol" w:hAnsi="Symbol" w:hint="default"/>
+        <w:sz w:val="20"/>
+      </w:rPr>
+    </w:lvl>
+    <w:lvl w:ilvl="1" w:tentative="1">
+      <w:start w:val="1"/>
+      <w:numFmt w:val="bullet"/>
+      <w:lvlText w:val="o"/>
+      <w:lvlJc w:val="left"/>
+      <w:pPr>
+        <w:tabs>
+          <w:tab w:val="num" w:pos="1440"/>
+        </w:tabs>
+        <w:ind w:left="1440" w:hanging="360"/>
+      </w:pPr>
+      <w:rPr>
+        <w:rFonts w:ascii="Courier New" w:hAnsi="Courier New" w:hint="default"/>
+        <w:sz w:val="20"/>
+      </w:rPr>
+    </w:lvl>
+    <w:lvl w:ilvl="2" w:tentative="1">
+      <w:start w:val="1"/>
+      <w:numFmt w:val="bullet"/>
+      <w:lvlText w:val=""/>
+      <w:lvlJc w:val="left"/>
+      <w:pPr>
+        <w:tabs>
+          <w:tab w:val="num" w:pos="2160"/>
+        </w:tabs>
+        <w:ind w:left="2160" w:hanging="360"/>
+      </w:pPr>
+      <w:rPr>
+        <w:rFonts w:ascii="Wingdings" w:hAnsi="Wingdings" w:hint="default"/>
+        <w:sz w:val="20"/>
+      </w:rPr>
+    </w:lvl>
+    <w:lvl w:ilvl="3" w:tentative="1">
+      <w:start w:val="1"/>
+      <w:numFmt w:val="bullet"/>
+      <w:lvlText w:val=""/>
+      <w:lvlJc w:val="left"/>
+      <w:pPr>
+        <w:tabs>
+          <w:tab w:val="num" w:pos="2880"/>
+        </w:tabs>
+        <w:ind w:left="2880" w:hanging="360"/>
+      </w:pPr>
+      <w:rPr>
+        <w:rFonts w:ascii="Wingdings" w:hAnsi="Wingdings" w:hint="default"/>
+        <w:sz w:val="20"/>
+      </w:rPr>
+    </w:lvl>
+    <w:lvl w:ilvl="4" w:tentative="1">
+      <w:start w:val="1"/>
+      <w:numFmt w:val="bullet"/>
+      <w:lvlText w:val=""/>
+      <w:lvlJc w:val="left"/>
+      <w:pPr>
+        <w:tabs>
+          <w:tab w:val="num" w:pos="3600"/>
+        </w:tabs>
+        <w:ind w:left="3600" w:hanging="360"/>
+      </w:pPr>
+      <w:rPr>
+        <w:rFonts w:ascii="Wingdings" w:hAnsi="Wingdings" w:hint="default"/>
+        <w:sz w:val="20"/>
+      </w:rPr>
+    </w:lvl>
+    <w:lvl w:ilvl="5" w:tentative="1">
+      <w:start w:val="1"/>
+      <w:numFmt w:val="bullet"/>
+      <w:lvlText w:val=""/>
+      <w:lvlJc w:val="left"/>
+      <w:pPr>
+        <w:tabs>
+          <w:tab w:val="num" w:pos="4320"/>
+        </w:tabs>
+        <w:ind w:left="4320" w:hanging="360"/>
+      </w:pPr>
+      <w:rPr>
+        <w:rFonts w:ascii="Wingdings" w:hAnsi="Wingdings" w:hint="default"/>
+        <w:sz w:val="20"/>
+      </w:rPr>
+    </w:lvl>
+    <w:lvl w:ilvl="6" w:tentative="1">
+      <w:start w:val="1"/>
+      <w:numFmt w:val="bullet"/>
+      <w:lvlText w:val=""/>
+      <w:lvlJc w:val="left"/>
+      <w:pPr>
+        <w:tabs>
+          <w:tab w:val="num" w:pos="5040"/>
+        </w:tabs>
+        <w:ind w:left="5040" w:hanging="360"/>
+      </w:pPr>
+      <w:rPr>
+        <w:rFonts w:ascii="Wingdings" w:hAnsi="Wingdings" w:hint="default"/>
+        <w:sz w:val="20"/>
+      </w:rPr>
+    </w:lvl>
+    <w:lvl w:ilvl="7" w:tentative="1">
+      <w:start w:val="1"/>
+      <w:numFmt w:val="bullet"/>
+      <w:lvlText w:val=""/>
+      <w:lvlJc w:val="left"/>
+      <w:pPr>
+        <w:tabs>
+          <w:tab w:val="num" w:pos="5760"/>
+        </w:tabs>
+        <w:ind w:left="5760" w:hanging="360"/>
+      </w:pPr>
+      <w:rPr>
+        <w:rFonts w:ascii="Wingdings" w:hAnsi="Wingdings" w:hint="default"/>
+        <w:sz w:val="20"/>
+      </w:rPr>
+    </w:lvl>
+    <w:lvl w:ilvl="8" w:tentative="1">
+      <w:start w:val="1"/>
+      <w:numFmt w:val="bullet"/>
+      <w:lvlText w:val=""/>
+      <w:lvlJc w:val="left"/>
+      <w:pPr>
+        <w:tabs>
+          <w:tab w:val="num" w:pos="6480"/>
+        </w:tabs>
+        <w:ind w:left="6480" w:hanging="360"/>
+      </w:pPr>
+      <w:rPr>
+        <w:rFonts w:ascii="Wingdings" w:hAnsi="Wingdings" w:hint="default"/>
+        <w:sz w:val="20"/>
+      </w:rPr>
+    </w:lvl>
+  </w:abstractNum>
+  <w:abstractNum w:abstractNumId="1" w15:restartNumberingAfterBreak="0">
+    <w:nsid w:val="0FCA5CAF"/>
+    <w:multiLevelType w:val="multilevel"/>
+    <w:tmpl w:val="0374CE12"/>
+    <w:lvl w:ilvl="0">
+      <w:start w:val="1"/>
+      <w:numFmt w:val="bullet"/>
+      <w:lvlText w:val=""/>
+      <w:lvlJc w:val="left"/>
+      <w:pPr>
+        <w:tabs>
+          <w:tab w:val="num" w:pos="720"/>
+        </w:tabs>
+        <w:ind w:left="720" w:hanging="360"/>
+      </w:pPr>
+      <w:rPr>
+        <w:rFonts w:ascii="Symbol" w:hAnsi="Symbol" w:hint="default"/>
+        <w:sz w:val="20"/>
+      </w:rPr>
+    </w:lvl>
+    <w:lvl w:ilvl="1" w:tentative="1">
+      <w:start w:val="1"/>
+      <w:numFmt w:val="bullet"/>
+      <w:lvlText w:val="o"/>
+      <w:lvlJc w:val="left"/>
+      <w:pPr>
+        <w:tabs>
+          <w:tab w:val="num" w:pos="1440"/>
+        </w:tabs>
+        <w:ind w:left="1440" w:hanging="360"/>
+      </w:pPr>
+      <w:rPr>
+        <w:rFonts w:ascii="Courier New" w:hAnsi="Courier New" w:hint="default"/>
+        <w:sz w:val="20"/>
+      </w:rPr>
+    </w:lvl>
+    <w:lvl w:ilvl="2" w:tentative="1">
+      <w:start w:val="1"/>
+      <w:numFmt w:val="bullet"/>
+      <w:lvlText w:val=""/>
+      <w:lvlJc w:val="left"/>
+      <w:pPr>
+        <w:tabs>
+          <w:tab w:val="num" w:pos="2160"/>
+        </w:tabs>
+        <w:ind w:left="2160" w:hanging="360"/>
+      </w:pPr>
+      <w:rPr>
+        <w:rFonts w:ascii="Wingdings" w:hAnsi="Wingdings" w:hint="default"/>
+        <w:sz w:val="20"/>
+      </w:rPr>
+    </w:lvl>
+    <w:lvl w:ilvl="3" w:tentative="1">
+      <w:start w:val="1"/>
+      <w:numFmt w:val="bullet"/>
+      <w:lvlText w:val=""/>
+      <w:lvlJc w:val="left"/>
+      <w:pPr>
+        <w:tabs>
+          <w:tab w:val="num" w:pos="2880"/>
+        </w:tabs>
+        <w:ind w:left="2880" w:hanging="360"/>
+      </w:pPr>
+      <w:rPr>
+        <w:rFonts w:ascii="Wingdings" w:hAnsi="Wingdings" w:hint="default"/>
+        <w:sz w:val="20"/>
+      </w:rPr>
+    </w:lvl>
+    <w:lvl w:ilvl="4" w:tentative="1">
+      <w:start w:val="1"/>
+      <w:numFmt w:val="bullet"/>
+      <w:lvlText w:val=""/>
+      <w:lvlJc w:val="left"/>
+      <w:pPr>
+        <w:tabs>
+          <w:tab w:val="num" w:pos="3600"/>
+        </w:tabs>
+        <w:ind w:left="3600" w:hanging="360"/>
+      </w:pPr>
+      <w:rPr>
+        <w:rFonts w:ascii="Wingdings" w:hAnsi="Wingdings" w:hint="default"/>
+        <w:sz w:val="20"/>
+      </w:rPr>
+    </w:lvl>
+    <w:lvl w:ilvl="5" w:tentative="1">
+      <w:start w:val="1"/>
+      <w:numFmt w:val="bullet"/>
+      <w:lvlText w:val=""/>
+      <w:lvlJc w:val="left"/>
+      <w:pPr>
+        <w:tabs>
+          <w:tab w:val="num" w:pos="4320"/>
+        </w:tabs>
+        <w:ind w:left="4320" w:hanging="360"/>
+      </w:pPr>
+      <w:rPr>
+        <w:rFonts w:ascii="Wingdings" w:hAnsi="Wingdings" w:hint="default"/>
+        <w:sz w:val="20"/>
+      </w:rPr>
+    </w:lvl>
+    <w:lvl w:ilvl="6" w:tentative="1">
+      <w:start w:val="1"/>
+      <w:numFmt w:val="bullet"/>
+      <w:lvlText w:val=""/>
+      <w:lvlJc w:val="left"/>
+      <w:pPr>
+        <w:tabs>
+          <w:tab w:val="num" w:pos="5040"/>
+        </w:tabs>
+        <w:ind w:left="5040" w:hanging="360"/>
+      </w:pPr>
+      <w:rPr>
+        <w:rFonts w:ascii="Wingdings" w:hAnsi="Wingdings" w:hint="default"/>
+        <w:sz w:val="20"/>
+      </w:rPr>
+    </w:lvl>
+    <w:lvl w:ilvl="7" w:tentative="1">
+      <w:start w:val="1"/>
+      <w:numFmt w:val="bullet"/>
+      <w:lvlText w:val=""/>
+      <w:lvlJc w:val="left"/>
+      <w:pPr>
+        <w:tabs>
+          <w:tab w:val="num" w:pos="5760"/>
+        </w:tabs>
+        <w:ind w:left="5760" w:hanging="360"/>
+      </w:pPr>
+      <w:rPr>
+        <w:rFonts w:ascii="Wingdings" w:hAnsi="Wingdings" w:hint="default"/>
+        <w:sz w:val="20"/>
+      </w:rPr>
+    </w:lvl>
+    <w:lvl w:ilvl="8" w:tentative="1">
+      <w:start w:val="1"/>
+      <w:numFmt w:val="bullet"/>
+      <w:lvlText w:val=""/>
+      <w:lvlJc w:val="left"/>
+      <w:pPr>
+        <w:tabs>
+          <w:tab w:val="num" w:pos="6480"/>
+        </w:tabs>
+        <w:ind w:left="6480" w:hanging="360"/>
+      </w:pPr>
+      <w:rPr>
+        <w:rFonts w:ascii="Wingdings" w:hAnsi="Wingdings" w:hint="default"/>
+        <w:sz w:val="20"/>
+      </w:rPr>
+    </w:lvl>
+  </w:abstractNum>
+  <w:abstractNum w:abstractNumId="2" w15:restartNumberingAfterBreak="0">
+    <w:nsid w:val="1B315CD6"/>
+    <w:multiLevelType w:val="multilevel"/>
+    <w:tmpl w:val="78C20D8C"/>
+    <w:lvl w:ilvl="0">
+      <w:start w:val="1"/>
+      <w:numFmt w:val="bullet"/>
+      <w:lvlText w:val=""/>
+      <w:lvlJc w:val="left"/>
+      <w:pPr>
+        <w:tabs>
+          <w:tab w:val="num" w:pos="720"/>
+        </w:tabs>
+        <w:ind w:left="720" w:hanging="360"/>
+      </w:pPr>
+      <w:rPr>
+        <w:rFonts w:ascii="Symbol" w:hAnsi="Symbol" w:hint="default"/>
+        <w:sz w:val="20"/>
+      </w:rPr>
+    </w:lvl>
+    <w:lvl w:ilvl="1" w:tentative="1">
+      <w:start w:val="1"/>
+      <w:numFmt w:val="bullet"/>
+      <w:lvlText w:val="o"/>
+      <w:lvlJc w:val="left"/>
+      <w:pPr>
+        <w:tabs>
+          <w:tab w:val="num" w:pos="1440"/>
+        </w:tabs>
+        <w:ind w:left="1440" w:hanging="360"/>
+      </w:pPr>
+      <w:rPr>
+        <w:rFonts w:ascii="Courier New" w:hAnsi="Courier New" w:hint="default"/>
+        <w:sz w:val="20"/>
+      </w:rPr>
+    </w:lvl>
+    <w:lvl w:ilvl="2" w:tentative="1">
+      <w:start w:val="1"/>
+      <w:numFmt w:val="bullet"/>
+      <w:lvlText w:val=""/>
+      <w:lvlJc w:val="left"/>
+      <w:pPr>
+        <w:tabs>
+          <w:tab w:val="num" w:pos="2160"/>
+        </w:tabs>
+        <w:ind w:left="2160" w:hanging="360"/>
+      </w:pPr>
+      <w:rPr>
+        <w:rFonts w:ascii="Wingdings" w:hAnsi="Wingdings" w:hint="default"/>
+        <w:sz w:val="20"/>
+      </w:rPr>
+    </w:lvl>
+    <w:lvl w:ilvl="3" w:tentative="1">
+      <w:start w:val="1"/>
+      <w:numFmt w:val="bullet"/>
+      <w:lvlText w:val=""/>
+      <w:lvlJc w:val="left"/>
+      <w:pPr>
+        <w:tabs>
+          <w:tab w:val="num" w:pos="2880"/>
+        </w:tabs>
+        <w:ind w:left="2880" w:hanging="360"/>
+      </w:pPr>
+      <w:rPr>
+        <w:rFonts w:ascii="Wingdings" w:hAnsi="Wingdings" w:hint="default"/>
+        <w:sz w:val="20"/>
+      </w:rPr>
+    </w:lvl>
+    <w:lvl w:ilvl="4" w:tentative="1">
+      <w:start w:val="1"/>
+      <w:numFmt w:val="bullet"/>
+      <w:lvlText w:val=""/>
+      <w:lvlJc w:val="left"/>
+      <w:pPr>
+        <w:tabs>
+          <w:tab w:val="num" w:pos="3600"/>
+        </w:tabs>
+        <w:ind w:left="3600" w:hanging="360"/>
+      </w:pPr>
+      <w:rPr>
+        <w:rFonts w:ascii="Wingdings" w:hAnsi="Wingdings" w:hint="default"/>
+        <w:sz w:val="20"/>
+      </w:rPr>
+    </w:lvl>
+    <w:lvl w:ilvl="5" w:tentative="1">
+      <w:start w:val="1"/>
+      <w:numFmt w:val="bullet"/>
+      <w:lvlText w:val=""/>
+      <w:lvlJc w:val="left"/>
+      <w:pPr>
+        <w:tabs>
+          <w:tab w:val="num" w:pos="4320"/>
+        </w:tabs>
+        <w:ind w:left="4320" w:hanging="360"/>
+      </w:pPr>
+      <w:rPr>
+        <w:rFonts w:ascii="Wingdings" w:hAnsi="Wingdings" w:hint="default"/>
+        <w:sz w:val="20"/>
+      </w:rPr>
+    </w:lvl>
+    <w:lvl w:ilvl="6" w:tentative="1">
+      <w:start w:val="1"/>
+      <w:numFmt w:val="bullet"/>
+      <w:lvlText w:val=""/>
+      <w:lvlJc w:val="left"/>
+      <w:pPr>
+        <w:tabs>
+          <w:tab w:val="num" w:pos="5040"/>
+        </w:tabs>
+        <w:ind w:left="5040" w:hanging="360"/>
+      </w:pPr>
+      <w:rPr>
+        <w:rFonts w:ascii="Wingdings" w:hAnsi="Wingdings" w:hint="default"/>
+        <w:sz w:val="20"/>
+      </w:rPr>
+    </w:lvl>
+    <w:lvl w:ilvl="7" w:tentative="1">
+      <w:start w:val="1"/>
+      <w:numFmt w:val="bullet"/>
+      <w:lvlText w:val=""/>
+      <w:lvlJc w:val="left"/>
+      <w:pPr>
+        <w:tabs>
+          <w:tab w:val="num" w:pos="5760"/>
+        </w:tabs>
+        <w:ind w:left="5760" w:hanging="360"/>
+      </w:pPr>
+      <w:rPr>
+        <w:rFonts w:ascii="Wingdings" w:hAnsi="Wingdings" w:hint="default"/>
+        <w:sz w:val="20"/>
+      </w:rPr>
+    </w:lvl>
+    <w:lvl w:ilvl="8" w:tentative="1">
+      <w:start w:val="1"/>
+      <w:numFmt w:val="bullet"/>
+      <w:lvlText w:val=""/>
+      <w:lvlJc w:val="left"/>
+      <w:pPr>
+        <w:tabs>
+          <w:tab w:val="num" w:pos="6480"/>
+        </w:tabs>
+        <w:ind w:left="6480" w:hanging="360"/>
+      </w:pPr>
+      <w:rPr>
+        <w:rFonts w:ascii="Wingdings" w:hAnsi="Wingdings" w:hint="default"/>
+        <w:sz w:val="20"/>
+      </w:rPr>
+    </w:lvl>
+  </w:abstractNum>
+  <w:abstractNum w:abstractNumId="3" w15:restartNumberingAfterBreak="0">
     <w:nsid w:val="22234FA5"/>
     <w:multiLevelType w:val="multilevel"/>
     <w:tmpl w:val="6E6EF958"/>
@@ -3087,7 +5720,346 @@
       </w:rPr>
     </w:lvl>
   </w:abstractNum>
-  <w:abstractNum w:abstractNumId="1" w15:restartNumberingAfterBreak="0">
+  <w:abstractNum w:abstractNumId="4" w15:restartNumberingAfterBreak="0">
+    <w:nsid w:val="3E13266B"/>
+    <w:multiLevelType w:val="multilevel"/>
+    <w:tmpl w:val="3AA2C142"/>
+    <w:lvl w:ilvl="0">
+      <w:start w:val="1"/>
+      <w:numFmt w:val="decimal"/>
+      <w:lvlText w:val="%1."/>
+      <w:lvlJc w:val="left"/>
+      <w:pPr>
+        <w:tabs>
+          <w:tab w:val="num" w:pos="720"/>
+        </w:tabs>
+        <w:ind w:left="720" w:hanging="360"/>
+      </w:pPr>
+    </w:lvl>
+    <w:lvl w:ilvl="1" w:tentative="1">
+      <w:start w:val="1"/>
+      <w:numFmt w:val="decimal"/>
+      <w:lvlText w:val="%2."/>
+      <w:lvlJc w:val="left"/>
+      <w:pPr>
+        <w:tabs>
+          <w:tab w:val="num" w:pos="1440"/>
+        </w:tabs>
+        <w:ind w:left="1440" w:hanging="360"/>
+      </w:pPr>
+    </w:lvl>
+    <w:lvl w:ilvl="2" w:tentative="1">
+      <w:start w:val="1"/>
+      <w:numFmt w:val="decimal"/>
+      <w:lvlText w:val="%3."/>
+      <w:lvlJc w:val="left"/>
+      <w:pPr>
+        <w:tabs>
+          <w:tab w:val="num" w:pos="2160"/>
+        </w:tabs>
+        <w:ind w:left="2160" w:hanging="360"/>
+      </w:pPr>
+    </w:lvl>
+    <w:lvl w:ilvl="3" w:tentative="1">
+      <w:start w:val="1"/>
+      <w:numFmt w:val="decimal"/>
+      <w:lvlText w:val="%4."/>
+      <w:lvlJc w:val="left"/>
+      <w:pPr>
+        <w:tabs>
+          <w:tab w:val="num" w:pos="2880"/>
+        </w:tabs>
+        <w:ind w:left="2880" w:hanging="360"/>
+      </w:pPr>
+    </w:lvl>
+    <w:lvl w:ilvl="4" w:tentative="1">
+      <w:start w:val="1"/>
+      <w:numFmt w:val="decimal"/>
+      <w:lvlText w:val="%5."/>
+      <w:lvlJc w:val="left"/>
+      <w:pPr>
+        <w:tabs>
+          <w:tab w:val="num" w:pos="3600"/>
+        </w:tabs>
+        <w:ind w:left="3600" w:hanging="360"/>
+      </w:pPr>
+    </w:lvl>
+    <w:lvl w:ilvl="5" w:tentative="1">
+      <w:start w:val="1"/>
+      <w:numFmt w:val="decimal"/>
+      <w:lvlText w:val="%6."/>
+      <w:lvlJc w:val="left"/>
+      <w:pPr>
+        <w:tabs>
+          <w:tab w:val="num" w:pos="4320"/>
+        </w:tabs>
+        <w:ind w:left="4320" w:hanging="360"/>
+      </w:pPr>
+    </w:lvl>
+    <w:lvl w:ilvl="6" w:tentative="1">
+      <w:start w:val="1"/>
+      <w:numFmt w:val="decimal"/>
+      <w:lvlText w:val="%7."/>
+      <w:lvlJc w:val="left"/>
+      <w:pPr>
+        <w:tabs>
+          <w:tab w:val="num" w:pos="5040"/>
+        </w:tabs>
+        <w:ind w:left="5040" w:hanging="360"/>
+      </w:pPr>
+    </w:lvl>
+    <w:lvl w:ilvl="7" w:tentative="1">
+      <w:start w:val="1"/>
+      <w:numFmt w:val="decimal"/>
+      <w:lvlText w:val="%8."/>
+      <w:lvlJc w:val="left"/>
+      <w:pPr>
+        <w:tabs>
+          <w:tab w:val="num" w:pos="5760"/>
+        </w:tabs>
+        <w:ind w:left="5760" w:hanging="360"/>
+      </w:pPr>
+    </w:lvl>
+    <w:lvl w:ilvl="8" w:tentative="1">
+      <w:start w:val="1"/>
+      <w:numFmt w:val="decimal"/>
+      <w:lvlText w:val="%9."/>
+      <w:lvlJc w:val="left"/>
+      <w:pPr>
+        <w:tabs>
+          <w:tab w:val="num" w:pos="6480"/>
+        </w:tabs>
+        <w:ind w:left="6480" w:hanging="360"/>
+      </w:pPr>
+    </w:lvl>
+  </w:abstractNum>
+  <w:abstractNum w:abstractNumId="5" w15:restartNumberingAfterBreak="0">
+    <w:nsid w:val="443F563D"/>
+    <w:multiLevelType w:val="multilevel"/>
+    <w:tmpl w:val="3290427C"/>
+    <w:lvl w:ilvl="0">
+      <w:start w:val="1"/>
+      <w:numFmt w:val="decimal"/>
+      <w:lvlText w:val="%1."/>
+      <w:lvlJc w:val="left"/>
+      <w:pPr>
+        <w:tabs>
+          <w:tab w:val="num" w:pos="720"/>
+        </w:tabs>
+        <w:ind w:left="720" w:hanging="360"/>
+      </w:pPr>
+    </w:lvl>
+    <w:lvl w:ilvl="1" w:tentative="1">
+      <w:start w:val="1"/>
+      <w:numFmt w:val="decimal"/>
+      <w:lvlText w:val="%2."/>
+      <w:lvlJc w:val="left"/>
+      <w:pPr>
+        <w:tabs>
+          <w:tab w:val="num" w:pos="1440"/>
+        </w:tabs>
+        <w:ind w:left="1440" w:hanging="360"/>
+      </w:pPr>
+    </w:lvl>
+    <w:lvl w:ilvl="2" w:tentative="1">
+      <w:start w:val="1"/>
+      <w:numFmt w:val="decimal"/>
+      <w:lvlText w:val="%3."/>
+      <w:lvlJc w:val="left"/>
+      <w:pPr>
+        <w:tabs>
+          <w:tab w:val="num" w:pos="2160"/>
+        </w:tabs>
+        <w:ind w:left="2160" w:hanging="360"/>
+      </w:pPr>
+    </w:lvl>
+    <w:lvl w:ilvl="3" w:tentative="1">
+      <w:start w:val="1"/>
+      <w:numFmt w:val="decimal"/>
+      <w:lvlText w:val="%4."/>
+      <w:lvlJc w:val="left"/>
+      <w:pPr>
+        <w:tabs>
+          <w:tab w:val="num" w:pos="2880"/>
+        </w:tabs>
+        <w:ind w:left="2880" w:hanging="360"/>
+      </w:pPr>
+    </w:lvl>
+    <w:lvl w:ilvl="4" w:tentative="1">
+      <w:start w:val="1"/>
+      <w:numFmt w:val="decimal"/>
+      <w:lvlText w:val="%5."/>
+      <w:lvlJc w:val="left"/>
+      <w:pPr>
+        <w:tabs>
+          <w:tab w:val="num" w:pos="3600"/>
+        </w:tabs>
+        <w:ind w:left="3600" w:hanging="360"/>
+      </w:pPr>
+    </w:lvl>
+    <w:lvl w:ilvl="5" w:tentative="1">
+      <w:start w:val="1"/>
+      <w:numFmt w:val="decimal"/>
+      <w:lvlText w:val="%6."/>
+      <w:lvlJc w:val="left"/>
+      <w:pPr>
+        <w:tabs>
+          <w:tab w:val="num" w:pos="4320"/>
+        </w:tabs>
+        <w:ind w:left="4320" w:hanging="360"/>
+      </w:pPr>
+    </w:lvl>
+    <w:lvl w:ilvl="6" w:tentative="1">
+      <w:start w:val="1"/>
+      <w:numFmt w:val="decimal"/>
+      <w:lvlText w:val="%7."/>
+      <w:lvlJc w:val="left"/>
+      <w:pPr>
+        <w:tabs>
+          <w:tab w:val="num" w:pos="5040"/>
+        </w:tabs>
+        <w:ind w:left="5040" w:hanging="360"/>
+      </w:pPr>
+    </w:lvl>
+    <w:lvl w:ilvl="7" w:tentative="1">
+      <w:start w:val="1"/>
+      <w:numFmt w:val="decimal"/>
+      <w:lvlText w:val="%8."/>
+      <w:lvlJc w:val="left"/>
+      <w:pPr>
+        <w:tabs>
+          <w:tab w:val="num" w:pos="5760"/>
+        </w:tabs>
+        <w:ind w:left="5760" w:hanging="360"/>
+      </w:pPr>
+    </w:lvl>
+    <w:lvl w:ilvl="8" w:tentative="1">
+      <w:start w:val="1"/>
+      <w:numFmt w:val="decimal"/>
+      <w:lvlText w:val="%9."/>
+      <w:lvlJc w:val="left"/>
+      <w:pPr>
+        <w:tabs>
+          <w:tab w:val="num" w:pos="6480"/>
+        </w:tabs>
+        <w:ind w:left="6480" w:hanging="360"/>
+      </w:pPr>
+    </w:lvl>
+  </w:abstractNum>
+  <w:abstractNum w:abstractNumId="6" w15:restartNumberingAfterBreak="0">
+    <w:nsid w:val="4F0656C2"/>
+    <w:multiLevelType w:val="multilevel"/>
+    <w:tmpl w:val="4B10357A"/>
+    <w:lvl w:ilvl="0">
+      <w:start w:val="1"/>
+      <w:numFmt w:val="decimal"/>
+      <w:lvlText w:val="%1."/>
+      <w:lvlJc w:val="left"/>
+      <w:pPr>
+        <w:tabs>
+          <w:tab w:val="num" w:pos="720"/>
+        </w:tabs>
+        <w:ind w:left="720" w:hanging="360"/>
+      </w:pPr>
+    </w:lvl>
+    <w:lvl w:ilvl="1" w:tentative="1">
+      <w:start w:val="1"/>
+      <w:numFmt w:val="decimal"/>
+      <w:lvlText w:val="%2."/>
+      <w:lvlJc w:val="left"/>
+      <w:pPr>
+        <w:tabs>
+          <w:tab w:val="num" w:pos="1440"/>
+        </w:tabs>
+        <w:ind w:left="1440" w:hanging="360"/>
+      </w:pPr>
+    </w:lvl>
+    <w:lvl w:ilvl="2" w:tentative="1">
+      <w:start w:val="1"/>
+      <w:numFmt w:val="decimal"/>
+      <w:lvlText w:val="%3."/>
+      <w:lvlJc w:val="left"/>
+      <w:pPr>
+        <w:tabs>
+          <w:tab w:val="num" w:pos="2160"/>
+        </w:tabs>
+        <w:ind w:left="2160" w:hanging="360"/>
+      </w:pPr>
+    </w:lvl>
+    <w:lvl w:ilvl="3" w:tentative="1">
+      <w:start w:val="1"/>
+      <w:numFmt w:val="decimal"/>
+      <w:lvlText w:val="%4."/>
+      <w:lvlJc w:val="left"/>
+      <w:pPr>
+        <w:tabs>
+          <w:tab w:val="num" w:pos="2880"/>
+        </w:tabs>
+        <w:ind w:left="2880" w:hanging="360"/>
+      </w:pPr>
+    </w:lvl>
+    <w:lvl w:ilvl="4" w:tentative="1">
+      <w:start w:val="1"/>
+      <w:numFmt w:val="decimal"/>
+      <w:lvlText w:val="%5."/>
+      <w:lvlJc w:val="left"/>
+      <w:pPr>
+        <w:tabs>
+          <w:tab w:val="num" w:pos="3600"/>
+        </w:tabs>
+        <w:ind w:left="3600" w:hanging="360"/>
+      </w:pPr>
+    </w:lvl>
+    <w:lvl w:ilvl="5" w:tentative="1">
+      <w:start w:val="1"/>
+      <w:numFmt w:val="decimal"/>
+      <w:lvlText w:val="%6."/>
+      <w:lvlJc w:val="left"/>
+      <w:pPr>
+        <w:tabs>
+          <w:tab w:val="num" w:pos="4320"/>
+        </w:tabs>
+        <w:ind w:left="4320" w:hanging="360"/>
+      </w:pPr>
+    </w:lvl>
+    <w:lvl w:ilvl="6" w:tentative="1">
+      <w:start w:val="1"/>
+      <w:numFmt w:val="decimal"/>
+      <w:lvlText w:val="%7."/>
+      <w:lvlJc w:val="left"/>
+      <w:pPr>
+        <w:tabs>
+          <w:tab w:val="num" w:pos="5040"/>
+        </w:tabs>
+        <w:ind w:left="5040" w:hanging="360"/>
+      </w:pPr>
+    </w:lvl>
+    <w:lvl w:ilvl="7" w:tentative="1">
+      <w:start w:val="1"/>
+      <w:numFmt w:val="decimal"/>
+      <w:lvlText w:val="%8."/>
+      <w:lvlJc w:val="left"/>
+      <w:pPr>
+        <w:tabs>
+          <w:tab w:val="num" w:pos="5760"/>
+        </w:tabs>
+        <w:ind w:left="5760" w:hanging="360"/>
+      </w:pPr>
+    </w:lvl>
+    <w:lvl w:ilvl="8" w:tentative="1">
+      <w:start w:val="1"/>
+      <w:numFmt w:val="decimal"/>
+      <w:lvlText w:val="%9."/>
+      <w:lvlJc w:val="left"/>
+      <w:pPr>
+        <w:tabs>
+          <w:tab w:val="num" w:pos="6480"/>
+        </w:tabs>
+        <w:ind w:left="6480" w:hanging="360"/>
+      </w:pPr>
+    </w:lvl>
+  </w:abstractNum>
+  <w:abstractNum w:abstractNumId="7" w15:restartNumberingAfterBreak="0">
     <w:nsid w:val="64234E83"/>
     <w:multiLevelType w:val="multilevel"/>
     <w:tmpl w:val="3B2669FA"/>
@@ -3236,7 +6208,7 @@
       </w:rPr>
     </w:lvl>
   </w:abstractNum>
-  <w:abstractNum w:abstractNumId="2" w15:restartNumberingAfterBreak="0">
+  <w:abstractNum w:abstractNumId="8" w15:restartNumberingAfterBreak="0">
     <w:nsid w:val="659E19F4"/>
     <w:multiLevelType w:val="multilevel"/>
     <w:tmpl w:val="DB226A5C"/>
@@ -3349,7 +6321,156 @@
       </w:pPr>
     </w:lvl>
   </w:abstractNum>
-  <w:abstractNum w:abstractNumId="3" w15:restartNumberingAfterBreak="0">
+  <w:abstractNum w:abstractNumId="9" w15:restartNumberingAfterBreak="0">
+    <w:nsid w:val="72A859C5"/>
+    <w:multiLevelType w:val="multilevel"/>
+    <w:tmpl w:val="67CC9608"/>
+    <w:lvl w:ilvl="0">
+      <w:start w:val="1"/>
+      <w:numFmt w:val="bullet"/>
+      <w:lvlText w:val=""/>
+      <w:lvlJc w:val="left"/>
+      <w:pPr>
+        <w:tabs>
+          <w:tab w:val="num" w:pos="720"/>
+        </w:tabs>
+        <w:ind w:left="720" w:hanging="360"/>
+      </w:pPr>
+      <w:rPr>
+        <w:rFonts w:ascii="Symbol" w:hAnsi="Symbol" w:hint="default"/>
+        <w:sz w:val="20"/>
+      </w:rPr>
+    </w:lvl>
+    <w:lvl w:ilvl="1" w:tentative="1">
+      <w:start w:val="1"/>
+      <w:numFmt w:val="bullet"/>
+      <w:lvlText w:val="o"/>
+      <w:lvlJc w:val="left"/>
+      <w:pPr>
+        <w:tabs>
+          <w:tab w:val="num" w:pos="1440"/>
+        </w:tabs>
+        <w:ind w:left="1440" w:hanging="360"/>
+      </w:pPr>
+      <w:rPr>
+        <w:rFonts w:ascii="Courier New" w:hAnsi="Courier New" w:hint="default"/>
+        <w:sz w:val="20"/>
+      </w:rPr>
+    </w:lvl>
+    <w:lvl w:ilvl="2" w:tentative="1">
+      <w:start w:val="1"/>
+      <w:numFmt w:val="bullet"/>
+      <w:lvlText w:val=""/>
+      <w:lvlJc w:val="left"/>
+      <w:pPr>
+        <w:tabs>
+          <w:tab w:val="num" w:pos="2160"/>
+        </w:tabs>
+        <w:ind w:left="2160" w:hanging="360"/>
+      </w:pPr>
+      <w:rPr>
+        <w:rFonts w:ascii="Wingdings" w:hAnsi="Wingdings" w:hint="default"/>
+        <w:sz w:val="20"/>
+      </w:rPr>
+    </w:lvl>
+    <w:lvl w:ilvl="3" w:tentative="1">
+      <w:start w:val="1"/>
+      <w:numFmt w:val="bullet"/>
+      <w:lvlText w:val=""/>
+      <w:lvlJc w:val="left"/>
+      <w:pPr>
+        <w:tabs>
+          <w:tab w:val="num" w:pos="2880"/>
+        </w:tabs>
+        <w:ind w:left="2880" w:hanging="360"/>
+      </w:pPr>
+      <w:rPr>
+        <w:rFonts w:ascii="Wingdings" w:hAnsi="Wingdings" w:hint="default"/>
+        <w:sz w:val="20"/>
+      </w:rPr>
+    </w:lvl>
+    <w:lvl w:ilvl="4" w:tentative="1">
+      <w:start w:val="1"/>
+      <w:numFmt w:val="bullet"/>
+      <w:lvlText w:val=""/>
+      <w:lvlJc w:val="left"/>
+      <w:pPr>
+        <w:tabs>
+          <w:tab w:val="num" w:pos="3600"/>
+        </w:tabs>
+        <w:ind w:left="3600" w:hanging="360"/>
+      </w:pPr>
+      <w:rPr>
+        <w:rFonts w:ascii="Wingdings" w:hAnsi="Wingdings" w:hint="default"/>
+        <w:sz w:val="20"/>
+      </w:rPr>
+    </w:lvl>
+    <w:lvl w:ilvl="5" w:tentative="1">
+      <w:start w:val="1"/>
+      <w:numFmt w:val="bullet"/>
+      <w:lvlText w:val=""/>
+      <w:lvlJc w:val="left"/>
+      <w:pPr>
+        <w:tabs>
+          <w:tab w:val="num" w:pos="4320"/>
+        </w:tabs>
+        <w:ind w:left="4320" w:hanging="360"/>
+      </w:pPr>
+      <w:rPr>
+        <w:rFonts w:ascii="Wingdings" w:hAnsi="Wingdings" w:hint="default"/>
+        <w:sz w:val="20"/>
+      </w:rPr>
+    </w:lvl>
+    <w:lvl w:ilvl="6" w:tentative="1">
+      <w:start w:val="1"/>
+      <w:numFmt w:val="bullet"/>
+      <w:lvlText w:val=""/>
+      <w:lvlJc w:val="left"/>
+      <w:pPr>
+        <w:tabs>
+          <w:tab w:val="num" w:pos="5040"/>
+        </w:tabs>
+        <w:ind w:left="5040" w:hanging="360"/>
+      </w:pPr>
+      <w:rPr>
+        <w:rFonts w:ascii="Wingdings" w:hAnsi="Wingdings" w:hint="default"/>
+        <w:sz w:val="20"/>
+      </w:rPr>
+    </w:lvl>
+    <w:lvl w:ilvl="7" w:tentative="1">
+      <w:start w:val="1"/>
+      <w:numFmt w:val="bullet"/>
+      <w:lvlText w:val=""/>
+      <w:lvlJc w:val="left"/>
+      <w:pPr>
+        <w:tabs>
+          <w:tab w:val="num" w:pos="5760"/>
+        </w:tabs>
+        <w:ind w:left="5760" w:hanging="360"/>
+      </w:pPr>
+      <w:rPr>
+        <w:rFonts w:ascii="Wingdings" w:hAnsi="Wingdings" w:hint="default"/>
+        <w:sz w:val="20"/>
+      </w:rPr>
+    </w:lvl>
+    <w:lvl w:ilvl="8" w:tentative="1">
+      <w:start w:val="1"/>
+      <w:numFmt w:val="bullet"/>
+      <w:lvlText w:val=""/>
+      <w:lvlJc w:val="left"/>
+      <w:pPr>
+        <w:tabs>
+          <w:tab w:val="num" w:pos="6480"/>
+        </w:tabs>
+        <w:ind w:left="6480" w:hanging="360"/>
+      </w:pPr>
+      <w:rPr>
+        <w:rFonts w:ascii="Wingdings" w:hAnsi="Wingdings" w:hint="default"/>
+        <w:sz w:val="20"/>
+      </w:rPr>
+    </w:lvl>
+  </w:abstractNum>
+  <w:abstractNum w:abstractNumId="10" w15:restartNumberingAfterBreak="0">
     <w:nsid w:val="765A2D7E"/>
     <w:multiLevelType w:val="multilevel"/>
     <w:tmpl w:val="D9F2C372"/>
@@ -3498,17 +6619,190 @@
       </w:rPr>
     </w:lvl>
   </w:abstractNum>
+  <w:abstractNum w:abstractNumId="11" w15:restartNumberingAfterBreak="0">
+    <w:nsid w:val="7C3B3B84"/>
+    <w:multiLevelType w:val="multilevel"/>
+    <w:tmpl w:val="CD4091E0"/>
+    <w:lvl w:ilvl="0">
+      <w:start w:val="1"/>
+      <w:numFmt w:val="bullet"/>
+      <w:lvlText w:val=""/>
+      <w:lvlJc w:val="left"/>
+      <w:pPr>
+        <w:tabs>
+          <w:tab w:val="num" w:pos="720"/>
+        </w:tabs>
+        <w:ind w:left="720" w:hanging="360"/>
+      </w:pPr>
+      <w:rPr>
+        <w:rFonts w:ascii="Symbol" w:hAnsi="Symbol" w:hint="default"/>
+        <w:sz w:val="20"/>
+      </w:rPr>
+    </w:lvl>
+    <w:lvl w:ilvl="1" w:tentative="1">
+      <w:start w:val="1"/>
+      <w:numFmt w:val="bullet"/>
+      <w:lvlText w:val="o"/>
+      <w:lvlJc w:val="left"/>
+      <w:pPr>
+        <w:tabs>
+          <w:tab w:val="num" w:pos="1440"/>
+        </w:tabs>
+        <w:ind w:left="1440" w:hanging="360"/>
+      </w:pPr>
+      <w:rPr>
+        <w:rFonts w:ascii="Courier New" w:hAnsi="Courier New" w:hint="default"/>
+        <w:sz w:val="20"/>
+      </w:rPr>
+    </w:lvl>
+    <w:lvl w:ilvl="2" w:tentative="1">
+      <w:start w:val="1"/>
+      <w:numFmt w:val="bullet"/>
+      <w:lvlText w:val=""/>
+      <w:lvlJc w:val="left"/>
+      <w:pPr>
+        <w:tabs>
+          <w:tab w:val="num" w:pos="2160"/>
+        </w:tabs>
+        <w:ind w:left="2160" w:hanging="360"/>
+      </w:pPr>
+      <w:rPr>
+        <w:rFonts w:ascii="Wingdings" w:hAnsi="Wingdings" w:hint="default"/>
+        <w:sz w:val="20"/>
+      </w:rPr>
+    </w:lvl>
+    <w:lvl w:ilvl="3" w:tentative="1">
+      <w:start w:val="1"/>
+      <w:numFmt w:val="bullet"/>
+      <w:lvlText w:val=""/>
+      <w:lvlJc w:val="left"/>
+      <w:pPr>
+        <w:tabs>
+          <w:tab w:val="num" w:pos="2880"/>
+        </w:tabs>
+        <w:ind w:left="2880" w:hanging="360"/>
+      </w:pPr>
+      <w:rPr>
+        <w:rFonts w:ascii="Wingdings" w:hAnsi="Wingdings" w:hint="default"/>
+        <w:sz w:val="20"/>
+      </w:rPr>
+    </w:lvl>
+    <w:lvl w:ilvl="4" w:tentative="1">
+      <w:start w:val="1"/>
+      <w:numFmt w:val="bullet"/>
+      <w:lvlText w:val=""/>
+      <w:lvlJc w:val="left"/>
+      <w:pPr>
+        <w:tabs>
+          <w:tab w:val="num" w:pos="3600"/>
+        </w:tabs>
+        <w:ind w:left="3600" w:hanging="360"/>
+      </w:pPr>
+      <w:rPr>
+        <w:rFonts w:ascii="Wingdings" w:hAnsi="Wingdings" w:hint="default"/>
+        <w:sz w:val="20"/>
+      </w:rPr>
+    </w:lvl>
+    <w:lvl w:ilvl="5" w:tentative="1">
+      <w:start w:val="1"/>
+      <w:numFmt w:val="bullet"/>
+      <w:lvlText w:val=""/>
+      <w:lvlJc w:val="left"/>
+      <w:pPr>
+        <w:tabs>
+          <w:tab w:val="num" w:pos="4320"/>
+        </w:tabs>
+        <w:ind w:left="4320" w:hanging="360"/>
+      </w:pPr>
+      <w:rPr>
+        <w:rFonts w:ascii="Wingdings" w:hAnsi="Wingdings" w:hint="default"/>
+        <w:sz w:val="20"/>
+      </w:rPr>
+    </w:lvl>
+    <w:lvl w:ilvl="6" w:tentative="1">
+      <w:start w:val="1"/>
+      <w:numFmt w:val="bullet"/>
+      <w:lvlText w:val=""/>
+      <w:lvlJc w:val="left"/>
+      <w:pPr>
+        <w:tabs>
+          <w:tab w:val="num" w:pos="5040"/>
+        </w:tabs>
+        <w:ind w:left="5040" w:hanging="360"/>
+      </w:pPr>
+      <w:rPr>
+        <w:rFonts w:ascii="Wingdings" w:hAnsi="Wingdings" w:hint="default"/>
+        <w:sz w:val="20"/>
+      </w:rPr>
+    </w:lvl>
+    <w:lvl w:ilvl="7" w:tentative="1">
+      <w:start w:val="1"/>
+      <w:numFmt w:val="bullet"/>
+      <w:lvlText w:val=""/>
+      <w:lvlJc w:val="left"/>
+      <w:pPr>
+        <w:tabs>
+          <w:tab w:val="num" w:pos="5760"/>
+        </w:tabs>
+        <w:ind w:left="5760" w:hanging="360"/>
+      </w:pPr>
+      <w:rPr>
+        <w:rFonts w:ascii="Wingdings" w:hAnsi="Wingdings" w:hint="default"/>
+        <w:sz w:val="20"/>
+      </w:rPr>
+    </w:lvl>
+    <w:lvl w:ilvl="8" w:tentative="1">
+      <w:start w:val="1"/>
+      <w:numFmt w:val="bullet"/>
+      <w:lvlText w:val=""/>
+      <w:lvlJc w:val="left"/>
+      <w:pPr>
+        <w:tabs>
+          <w:tab w:val="num" w:pos="6480"/>
+        </w:tabs>
+        <w:ind w:left="6480" w:hanging="360"/>
+      </w:pPr>
+      <w:rPr>
+        <w:rFonts w:ascii="Wingdings" w:hAnsi="Wingdings" w:hint="default"/>
+        <w:sz w:val="20"/>
+      </w:rPr>
+    </w:lvl>
+  </w:abstractNum>
   <w:num w:numId="1" w16cid:durableId="259995334">
+    <w:abstractNumId w:val="7"/>
+  </w:num>
+  <w:num w:numId="2" w16cid:durableId="1091005966">
+    <w:abstractNumId w:val="10"/>
+  </w:num>
+  <w:num w:numId="3" w16cid:durableId="1783962317">
+    <w:abstractNumId w:val="8"/>
+  </w:num>
+  <w:num w:numId="4" w16cid:durableId="881984271">
+    <w:abstractNumId w:val="3"/>
+  </w:num>
+  <w:num w:numId="5" w16cid:durableId="1121146538">
+    <w:abstractNumId w:val="4"/>
+  </w:num>
+  <w:num w:numId="6" w16cid:durableId="1707245179">
+    <w:abstractNumId w:val="11"/>
+  </w:num>
+  <w:num w:numId="7" w16cid:durableId="1677730791">
+    <w:abstractNumId w:val="0"/>
+  </w:num>
+  <w:num w:numId="8" w16cid:durableId="195822324">
+    <w:abstractNumId w:val="6"/>
+  </w:num>
+  <w:num w:numId="9" w16cid:durableId="350568055">
+    <w:abstractNumId w:val="9"/>
+  </w:num>
+  <w:num w:numId="10" w16cid:durableId="405035724">
     <w:abstractNumId w:val="1"/>
   </w:num>
-  <w:num w:numId="2" w16cid:durableId="1091005966">
-    <w:abstractNumId w:val="3"/>
-  </w:num>
-  <w:num w:numId="3" w16cid:durableId="1783962317">
+  <w:num w:numId="11" w16cid:durableId="2064861613">
     <w:abstractNumId w:val="2"/>
   </w:num>
-  <w:num w:numId="4" w16cid:durableId="881984271">
-    <w:abstractNumId w:val="0"/>
+  <w:num w:numId="12" w16cid:durableId="1881743385">
+    <w:abstractNumId w:val="5"/>
   </w:num>
 </w:numbering>
 </file>
@@ -3963,7 +7257,6 @@
     <w:next w:val="Normal"/>
     <w:link w:val="Heading3Char"/>
     <w:uiPriority w:val="9"/>
-    <w:semiHidden/>
     <w:unhideWhenUsed/>
     <w:qFormat/>
     <w:rsid w:val="00F60494"/>
@@ -4170,7 +7463,6 @@
     <w:basedOn w:val="DefaultParagraphFont"/>
     <w:link w:val="Heading3"/>
     <w:uiPriority w:val="9"/>
-    <w:semiHidden/>
     <w:rsid w:val="00F60494"/>
     <w:rPr>
       <w:rFonts w:eastAsiaTheme="majorEastAsia" w:cstheme="majorBidi"/>
@@ -4472,6 +7764,17 @@
       <w:szCs w:val="20"/>
     </w:rPr>
   </w:style>
+  <w:style w:type="character" w:styleId="Emphasis">
+    <w:name w:val="Emphasis"/>
+    <w:basedOn w:val="DefaultParagraphFont"/>
+    <w:uiPriority w:val="20"/>
+    <w:qFormat/>
+    <w:rsid w:val="00D44BB7"/>
+    <w:rPr>
+      <w:i/>
+      <w:iCs/>
+    </w:rPr>
+  </w:style>
 </w:styles>
 </file>
 

</xml_diff>

<commit_message>
SPA FOUC prevention — CSS prefetch on hover, first-load cloak, scroll restore
- CSS prefetch: parse prefetched HTML on hover, inject <link rel="preload"> for page CSS
- First-load cloak: inline CSS hides main (opacity:0), reveal on DOMContentLoaded + 800ms fallback
- Scroll restore: save scrollY in history.state, restore on back/forward
- Opacity transition: 100ms -> 150ms for smoother fade
- Preload cleanup: remove stale data-spa-preload links before new CSS load
- Cache bump: v430 -> v431
- Docs: SPA FOUC rules, session log, app-core architecture, troubleshooting entry #12

Co-Authored-By: Claude Opus 4.6 (1M context) <noreply@anthropic.com>
</commit_message>
<xml_diff>
--- a/amolnama_news/notes/SPA.docx
+++ b/amolnama_news/notes/SPA.docx
@@ -5107,11 +5107,7 @@
         <w:t>).</w:t>
       </w:r>
     </w:p>
-    <w:p>
-      <w:r>
-        <w:t>s</w:t>
-      </w:r>
-    </w:p>
+    <w:p/>
     <w:sectPr>
       <w:pgSz w:w="11906" w:h="16838"/>
       <w:pgMar w:top="1440" w:right="1440" w:bottom="1440" w:left="1440" w:header="708" w:footer="708" w:gutter="0"/>

</xml_diff>